<commit_message>
All task expect 6 done
</commit_message>
<xml_diff>
--- a/Economics/ПРИ123-ЭКОНОМИКА-#01-Нямаа.docx
+++ b/Economics/ПРИ123-ЭКОНОМИКА-#01-Нямаа.docx
@@ -1408,13 +1408,7 @@
         <w:rPr>
           <w:sz w:val="28"/>
         </w:rPr>
-        <w:t xml:space="preserve">схожее с предыдущим классом, то есть </w:t>
-      </w:r>
-      <w:r>
-        <w:rPr>
-          <w:sz w:val="28"/>
-        </w:rPr>
-        <w:t xml:space="preserve">отрицательное </w:t>
+        <w:t xml:space="preserve">схожее с предыдущим классом, то есть отрицательное </w:t>
       </w:r>
       <w:r>
         <w:rPr>
@@ -1660,6 +1654,33 @@
     </w:p>
     <w:p>
       <w:pPr>
+        <w:pStyle w:val="a6"/>
+        <w:numPr>
+          <w:ilvl w:val="0"/>
+          <w:numId w:val="6"/>
+        </w:numPr>
+        <w:spacing w:line="360" w:lineRule="auto"/>
+        <w:ind w:left="0" w:firstLine="851"/>
+        <w:jc w:val="both"/>
+        <w:rPr>
+          <w:sz w:val="28"/>
+        </w:rPr>
+      </w:pPr>
+      <w:r>
+        <w:rPr>
+          <w:sz w:val="28"/>
+        </w:rPr>
+        <w:t>Меркантилизм</w:t>
+      </w:r>
+      <w:r>
+        <w:rPr>
+          <w:sz w:val="28"/>
+        </w:rPr>
+        <w:t>.</w:t>
+      </w:r>
+    </w:p>
+    <w:p>
+      <w:pPr>
         <w:spacing w:line="360" w:lineRule="auto"/>
         <w:ind w:firstLine="709"/>
         <w:jc w:val="both"/>
@@ -1671,27 +1692,355 @@
         <w:rPr>
           <w:sz w:val="28"/>
         </w:rPr>
-        <w:t>Для выполнение данной работы была выбрана тема «Аренда виртуального сервера (</w:t>
-      </w:r>
-      <w:r>
-        <w:rPr>
-          <w:sz w:val="28"/>
-          <w:lang w:val="en-US"/>
-        </w:rPr>
-        <w:t>VPS</w:t>
-      </w:r>
-      <w:r>
-        <w:rPr>
-          <w:sz w:val="28"/>
-        </w:rPr>
-        <w:t xml:space="preserve">)», использовалась программа </w:t>
-      </w:r>
-      <w:r>
-        <w:rPr>
-          <w:sz w:val="28"/>
-          <w:lang w:val="en-US"/>
-        </w:rPr>
-        <w:t>All</w:t>
+        <w:t>Представители:</w:t>
+      </w:r>
+      <w:r>
+        <w:rPr>
+          <w:sz w:val="28"/>
+        </w:rPr>
+        <w:t xml:space="preserve"> Томас Ман, Уильям Стаффорд, Антуан де </w:t>
+      </w:r>
+      <w:r>
+        <w:rPr>
+          <w:sz w:val="28"/>
+        </w:rPr>
+        <w:t>Монкретьен</w:t>
+      </w:r>
+      <w:r>
+        <w:rPr>
+          <w:sz w:val="28"/>
+        </w:rPr>
+        <w:t xml:space="preserve">, </w:t>
+      </w:r>
+      <w:r>
+        <w:rPr>
+          <w:sz w:val="28"/>
+        </w:rPr>
+        <w:t>Антонио Серра</w:t>
+      </w:r>
+      <w:r>
+        <w:rPr>
+          <w:sz w:val="28"/>
+        </w:rPr>
+        <w:t>.</w:t>
+      </w:r>
+    </w:p>
+    <w:p>
+      <w:pPr>
+        <w:spacing w:line="360" w:lineRule="auto"/>
+        <w:ind w:firstLine="709"/>
+        <w:jc w:val="both"/>
+        <w:rPr>
+          <w:sz w:val="28"/>
+        </w:rPr>
+      </w:pPr>
+      <w:r>
+        <w:rPr>
+          <w:sz w:val="28"/>
+        </w:rPr>
+        <w:t>Сфера исследования:</w:t>
+      </w:r>
+      <w:r>
+        <w:rPr>
+          <w:sz w:val="28"/>
+        </w:rPr>
+        <w:t xml:space="preserve"> создания богатства общества при помощи внешней торговли, накопления драгоценных металлов и поддержки государства.</w:t>
+      </w:r>
+    </w:p>
+    <w:p>
+      <w:pPr>
+        <w:spacing w:line="360" w:lineRule="auto"/>
+        <w:ind w:firstLine="709"/>
+        <w:jc w:val="both"/>
+        <w:rPr>
+          <w:sz w:val="28"/>
+        </w:rPr>
+      </w:pPr>
+      <w:r>
+        <w:rPr>
+          <w:sz w:val="28"/>
+        </w:rPr>
+        <w:lastRenderedPageBreak/>
+        <w:t>Вклад в науку:</w:t>
+      </w:r>
+      <w:r>
+        <w:rPr>
+          <w:sz w:val="28"/>
+        </w:rPr>
+        <w:t xml:space="preserve"> сформирование концепции торгового баланса (экспорт больше импорта), активное привлечение государства в регулирование торговли</w:t>
+      </w:r>
+    </w:p>
+    <w:p>
+      <w:pPr>
+        <w:pStyle w:val="a6"/>
+        <w:numPr>
+          <w:ilvl w:val="0"/>
+          <w:numId w:val="6"/>
+        </w:numPr>
+        <w:spacing w:line="360" w:lineRule="auto"/>
+        <w:ind w:left="0" w:firstLine="851"/>
+        <w:jc w:val="both"/>
+        <w:rPr>
+          <w:sz w:val="28"/>
+        </w:rPr>
+      </w:pPr>
+      <w:r>
+        <w:rPr>
+          <w:sz w:val="28"/>
+        </w:rPr>
+        <w:t>Марксизм</w:t>
+      </w:r>
+      <w:r>
+        <w:rPr>
+          <w:sz w:val="28"/>
+        </w:rPr>
+        <w:t>.</w:t>
+      </w:r>
+    </w:p>
+    <w:p>
+      <w:pPr>
+        <w:spacing w:line="360" w:lineRule="auto"/>
+        <w:ind w:firstLine="709"/>
+        <w:jc w:val="both"/>
+        <w:rPr>
+          <w:sz w:val="28"/>
+        </w:rPr>
+      </w:pPr>
+      <w:r>
+        <w:rPr>
+          <w:sz w:val="28"/>
+        </w:rPr>
+        <w:t>Представители:</w:t>
+      </w:r>
+      <w:r>
+        <w:rPr>
+          <w:sz w:val="28"/>
+        </w:rPr>
+        <w:t xml:space="preserve"> Карл Маркс, Фридрих Энгельс.</w:t>
+      </w:r>
+    </w:p>
+    <w:p>
+      <w:pPr>
+        <w:spacing w:line="360" w:lineRule="auto"/>
+        <w:ind w:firstLine="709"/>
+        <w:jc w:val="both"/>
+        <w:rPr>
+          <w:sz w:val="28"/>
+        </w:rPr>
+      </w:pPr>
+      <w:r>
+        <w:rPr>
+          <w:sz w:val="28"/>
+        </w:rPr>
+        <w:t>Сфера исследования:</w:t>
+      </w:r>
+      <w:r>
+        <w:rPr>
+          <w:sz w:val="28"/>
+        </w:rPr>
+        <w:t xml:space="preserve"> изучение закономерностей капитализма, определение его исторического места, исследование производственных отношений.</w:t>
+      </w:r>
+    </w:p>
+    <w:p>
+      <w:pPr>
+        <w:spacing w:line="360" w:lineRule="auto"/>
+        <w:ind w:firstLine="709"/>
+        <w:jc w:val="both"/>
+        <w:rPr>
+          <w:sz w:val="28"/>
+        </w:rPr>
+      </w:pPr>
+      <w:r>
+        <w:rPr>
+          <w:sz w:val="28"/>
+        </w:rPr>
+        <w:t>Вклад в науку:</w:t>
+      </w:r>
+      <w:r>
+        <w:rPr>
+          <w:sz w:val="28"/>
+        </w:rPr>
+        <w:t xml:space="preserve"> внедрение понятия прибавочной стоимости и расширение теории трудовой стоимости, анализ капиталистической системы.</w:t>
+      </w:r>
+    </w:p>
+    <w:p>
+      <w:pPr>
+        <w:pStyle w:val="a6"/>
+        <w:numPr>
+          <w:ilvl w:val="0"/>
+          <w:numId w:val="6"/>
+        </w:numPr>
+        <w:spacing w:line="360" w:lineRule="auto"/>
+        <w:ind w:left="0" w:firstLine="851"/>
+        <w:jc w:val="both"/>
+        <w:rPr>
+          <w:sz w:val="28"/>
+        </w:rPr>
+      </w:pPr>
+      <w:r>
+        <w:rPr>
+          <w:sz w:val="28"/>
+        </w:rPr>
+        <w:t>Монетаризм.</w:t>
+      </w:r>
+    </w:p>
+    <w:p>
+      <w:pPr>
+        <w:spacing w:line="360" w:lineRule="auto"/>
+        <w:ind w:firstLine="709"/>
+        <w:jc w:val="both"/>
+        <w:rPr>
+          <w:sz w:val="28"/>
+        </w:rPr>
+      </w:pPr>
+      <w:r>
+        <w:rPr>
+          <w:sz w:val="28"/>
+        </w:rPr>
+        <w:t>Представители:</w:t>
+      </w:r>
+      <w:r>
+        <w:rPr>
+          <w:sz w:val="28"/>
+        </w:rPr>
+        <w:t xml:space="preserve"> Милтон Фридман, Карл Бруннер.</w:t>
+      </w:r>
+    </w:p>
+    <w:p>
+      <w:pPr>
+        <w:spacing w:line="360" w:lineRule="auto"/>
+        <w:ind w:firstLine="709"/>
+        <w:jc w:val="both"/>
+        <w:rPr>
+          <w:sz w:val="28"/>
+        </w:rPr>
+      </w:pPr>
+      <w:r>
+        <w:rPr>
+          <w:sz w:val="28"/>
+        </w:rPr>
+        <w:t>Сфера исследования:</w:t>
+      </w:r>
+      <w:r>
+        <w:rPr>
+          <w:sz w:val="28"/>
+        </w:rPr>
+        <w:t xml:space="preserve"> изучение влияния денежной массы на экономику, сосредоточение </w:t>
+      </w:r>
+      <w:r>
+        <w:rPr>
+          <w:sz w:val="28"/>
+        </w:rPr>
+        <w:t>на количестве денег как на главный фактор, определяющий цены.</w:t>
+      </w:r>
+    </w:p>
+    <w:p>
+      <w:pPr>
+        <w:spacing w:line="360" w:lineRule="auto"/>
+        <w:ind w:firstLine="709"/>
+        <w:jc w:val="both"/>
+        <w:rPr>
+          <w:sz w:val="28"/>
+        </w:rPr>
+      </w:pPr>
+      <w:r>
+        <w:rPr>
+          <w:sz w:val="28"/>
+        </w:rPr>
+        <w:t>Вклад в науку:</w:t>
+      </w:r>
+      <w:r>
+        <w:rPr>
+          <w:sz w:val="28"/>
+        </w:rPr>
+        <w:t xml:space="preserve"> утверждение, что денежная масса является ключевым фактором, определяющим экономическое развитие и инфляцию.</w:t>
+      </w:r>
+    </w:p>
+    <w:p>
+      <w:pPr>
+        <w:pStyle w:val="a6"/>
+        <w:numPr>
+          <w:ilvl w:val="0"/>
+          <w:numId w:val="6"/>
+        </w:numPr>
+        <w:spacing w:line="360" w:lineRule="auto"/>
+        <w:ind w:left="0" w:firstLine="851"/>
+        <w:jc w:val="both"/>
+        <w:rPr>
+          <w:sz w:val="28"/>
+        </w:rPr>
+      </w:pPr>
+      <w:r>
+        <w:rPr>
+          <w:sz w:val="28"/>
+        </w:rPr>
+        <w:t>Маржинализм</w:t>
+      </w:r>
+      <w:r>
+        <w:rPr>
+          <w:sz w:val="28"/>
+        </w:rPr>
+        <w:t>.</w:t>
+      </w:r>
+    </w:p>
+    <w:p>
+      <w:pPr>
+        <w:spacing w:line="360" w:lineRule="auto"/>
+        <w:ind w:firstLine="709"/>
+        <w:jc w:val="both"/>
+        <w:rPr>
+          <w:sz w:val="28"/>
+        </w:rPr>
+      </w:pPr>
+      <w:r>
+        <w:rPr>
+          <w:sz w:val="28"/>
+        </w:rPr>
+        <w:t>Представители:</w:t>
+      </w:r>
+      <w:r>
+        <w:rPr>
+          <w:sz w:val="28"/>
+        </w:rPr>
+        <w:t xml:space="preserve"> Джевонс, Менгер, Вальрас, Визер.</w:t>
+      </w:r>
+    </w:p>
+    <w:p>
+      <w:pPr>
+        <w:spacing w:line="360" w:lineRule="auto"/>
+        <w:ind w:firstLine="709"/>
+        <w:jc w:val="both"/>
+        <w:rPr>
+          <w:sz w:val="28"/>
+        </w:rPr>
+      </w:pPr>
+      <w:r>
+        <w:rPr>
+          <w:sz w:val="28"/>
+        </w:rPr>
+        <w:t>Сфера исследования:</w:t>
+      </w:r>
+      <w:r>
+        <w:rPr>
+          <w:sz w:val="28"/>
+        </w:rPr>
+        <w:t xml:space="preserve"> исследование закономерности экономических процессов на основе оперирования «предельными» понятиями, то есть максимизация собственного удовлетворения отдельных хозяйствующих субъектов.</w:t>
+      </w:r>
+    </w:p>
+    <w:p>
+      <w:pPr>
+        <w:spacing w:line="360" w:lineRule="auto"/>
+        <w:ind w:firstLine="709"/>
+        <w:jc w:val="both"/>
+        <w:rPr>
+          <w:sz w:val="28"/>
+        </w:rPr>
+      </w:pPr>
+      <w:r>
+        <w:rPr>
+          <w:sz w:val="28"/>
+        </w:rPr>
+        <w:t>Вклад в науку:</w:t>
       </w:r>
       <w:r>
         <w:rPr>
@@ -1702,28 +2051,188 @@
       <w:r>
         <w:rPr>
           <w:sz w:val="28"/>
-          <w:lang w:val="en-US"/>
-        </w:rPr>
-        <w:t>Fusion</w:t>
-      </w:r>
-      <w:r>
-        <w:rPr>
-          <w:sz w:val="28"/>
+        </w:rPr>
+        <w:t>сформирование теории предельной полезности, сосредоточение на потребителях и составление более точных моделей экономического поведения.</w:t>
+      </w:r>
+    </w:p>
+    <w:p>
+      <w:pPr>
+        <w:pStyle w:val="a6"/>
+        <w:numPr>
+          <w:ilvl w:val="0"/>
+          <w:numId w:val="6"/>
+        </w:numPr>
+        <w:spacing w:line="360" w:lineRule="auto"/>
+        <w:ind w:left="0" w:firstLine="851"/>
+        <w:jc w:val="both"/>
+        <w:rPr>
+          <w:sz w:val="28"/>
+        </w:rPr>
+      </w:pPr>
+      <w:r>
+        <w:rPr>
+          <w:sz w:val="28"/>
+        </w:rPr>
+        <w:t>Институционализм</w:t>
+      </w:r>
+      <w:r>
+        <w:rPr>
+          <w:sz w:val="28"/>
+        </w:rPr>
+        <w:t>.</w:t>
+      </w:r>
+    </w:p>
+    <w:p>
+      <w:pPr>
+        <w:spacing w:line="360" w:lineRule="auto"/>
+        <w:ind w:firstLine="709"/>
+        <w:jc w:val="both"/>
+        <w:rPr>
+          <w:sz w:val="28"/>
+        </w:rPr>
+      </w:pPr>
+      <w:r>
+        <w:rPr>
+          <w:sz w:val="28"/>
+        </w:rPr>
+        <w:t>Представители:</w:t>
+      </w:r>
+      <w:r>
+        <w:rPr>
+          <w:rFonts w:ascii="Arial" w:hAnsi="Arial" w:cs="Arial"/>
+          <w:color w:val="FFFFFF"/>
         </w:rPr>
         <w:t xml:space="preserve"> </w:t>
       </w:r>
       <w:r>
         <w:rPr>
           <w:sz w:val="28"/>
-          <w:lang w:val="en-US"/>
-        </w:rPr>
-        <w:t>PM</w:t>
-      </w:r>
-      <w:r>
-        <w:rPr>
-          <w:sz w:val="28"/>
-        </w:rPr>
-        <w:t xml:space="preserve"> 8</w:t>
+        </w:rPr>
+        <w:t>Торстейн Веблен</w:t>
+      </w:r>
+      <w:r>
+        <w:rPr>
+          <w:sz w:val="28"/>
+        </w:rPr>
+        <w:t xml:space="preserve">, </w:t>
+      </w:r>
+      <w:r>
+        <w:rPr>
+          <w:sz w:val="28"/>
+        </w:rPr>
+        <w:t>Уэсли Клэйр Митчелл</w:t>
+      </w:r>
+      <w:r>
+        <w:rPr>
+          <w:sz w:val="28"/>
+        </w:rPr>
+        <w:t xml:space="preserve">, </w:t>
+      </w:r>
+      <w:r>
+        <w:rPr>
+          <w:sz w:val="28"/>
+        </w:rPr>
+        <w:t>Джон Морис Кларк</w:t>
+      </w:r>
+    </w:p>
+    <w:p>
+      <w:pPr>
+        <w:spacing w:line="360" w:lineRule="auto"/>
+        <w:ind w:firstLine="709"/>
+        <w:jc w:val="both"/>
+        <w:rPr>
+          <w:sz w:val="28"/>
+        </w:rPr>
+      </w:pPr>
+      <w:r>
+        <w:rPr>
+          <w:sz w:val="28"/>
+        </w:rPr>
+        <w:t>Сфера исследования:</w:t>
+      </w:r>
+      <w:r>
+        <w:rPr>
+          <w:sz w:val="28"/>
+        </w:rPr>
+        <w:t xml:space="preserve"> изучение эволюции социальных институтов </w:t>
+      </w:r>
+      <w:r>
+        <w:rPr>
+          <w:sz w:val="28"/>
+        </w:rPr>
+        <w:lastRenderedPageBreak/>
+        <w:t>(традиции, право, мораль, семья и т.д.) и их влияние на формирование экономического поведения.</w:t>
+      </w:r>
+    </w:p>
+    <w:p>
+      <w:pPr>
+        <w:spacing w:line="360" w:lineRule="auto"/>
+        <w:ind w:firstLine="709"/>
+        <w:jc w:val="both"/>
+        <w:rPr>
+          <w:sz w:val="28"/>
+        </w:rPr>
+      </w:pPr>
+      <w:r>
+        <w:rPr>
+          <w:sz w:val="28"/>
+        </w:rPr>
+        <w:t>Вклад в науку:</w:t>
+      </w:r>
+      <w:r>
+        <w:rPr>
+          <w:sz w:val="28"/>
+        </w:rPr>
+        <w:t xml:space="preserve"> внедрение анализа социальных институтов для более точного формирования экономического поведения.</w:t>
+      </w:r>
+    </w:p>
+    <w:p>
+      <w:pPr>
+        <w:spacing w:line="360" w:lineRule="auto"/>
+        <w:jc w:val="center"/>
+        <w:rPr>
+          <w:sz w:val="28"/>
+        </w:rPr>
+      </w:pPr>
+      <w:r>
+        <w:rPr>
+          <w:sz w:val="28"/>
+        </w:rPr>
+        <w:t>ЗАДАНИЕ 5.</w:t>
+      </w:r>
+    </w:p>
+    <w:p>
+      <w:pPr>
+        <w:spacing w:line="360" w:lineRule="auto"/>
+        <w:ind w:firstLine="709"/>
+        <w:jc w:val="both"/>
+        <w:rPr>
+          <w:sz w:val="28"/>
+        </w:rPr>
+      </w:pPr>
+      <w:r>
+        <w:rPr>
+          <w:sz w:val="28"/>
+        </w:rPr>
+        <w:t>Определить</w:t>
+      </w:r>
+      <w:r>
+        <w:rPr>
+          <w:sz w:val="28"/>
+        </w:rPr>
+        <w:t xml:space="preserve">, кто лишний в предложенном перечне имен, где трое из четырех должны быть объединены одной школой или одной концепцией. </w:t>
+      </w:r>
+      <w:r>
+        <w:rPr>
+          <w:sz w:val="28"/>
+        </w:rPr>
+        <w:t>Охарактеризовать</w:t>
+      </w:r>
+      <w:r>
+        <w:rPr>
+          <w:sz w:val="28"/>
+        </w:rPr>
+        <w:t xml:space="preserve"> школы (концепции)</w:t>
       </w:r>
       <w:r>
         <w:rPr>
@@ -1734,29 +2243,463 @@
     </w:p>
     <w:p>
       <w:pPr>
-        <w:pStyle w:val="a8"/>
-        <w:rPr>
-          <w:sz w:val="28"/>
-          <w:szCs w:val="28"/>
-          <w:lang w:val="ru-RU"/>
-        </w:rPr>
-      </w:pPr>
-    </w:p>
-    <w:p>
-      <w:pPr>
         <w:spacing w:line="360" w:lineRule="auto"/>
         <w:jc w:val="center"/>
         <w:rPr>
           <w:sz w:val="28"/>
-          <w:szCs w:val="28"/>
-        </w:rPr>
-      </w:pPr>
-      <w:r>
-        <w:rPr>
-          <w:sz w:val="28"/>
-          <w:szCs w:val="28"/>
-        </w:rPr>
-        <w:t>Рисунок 1. Выполнение операции с отрицательными числами.</w:t>
+        </w:rPr>
+      </w:pPr>
+      <w:r>
+        <w:rPr>
+          <w:sz w:val="28"/>
+        </w:rPr>
+        <w:t>ВЫПОЛНЕНИЕ РАБОТЫ:</w:t>
+      </w:r>
+    </w:p>
+    <w:p>
+      <w:pPr>
+        <w:pStyle w:val="a6"/>
+        <w:numPr>
+          <w:ilvl w:val="0"/>
+          <w:numId w:val="7"/>
+        </w:numPr>
+        <w:spacing w:line="360" w:lineRule="auto"/>
+        <w:ind w:left="0" w:firstLine="851"/>
+        <w:jc w:val="both"/>
+        <w:rPr>
+          <w:sz w:val="28"/>
+          <w:szCs w:val="28"/>
+        </w:rPr>
+      </w:pPr>
+      <w:r>
+        <w:rPr>
+          <w:sz w:val="28"/>
+          <w:szCs w:val="28"/>
+        </w:rPr>
+        <w:t>Лишним является Тюнен, так как остальные (</w:t>
+      </w:r>
+      <w:r>
+        <w:rPr>
+          <w:sz w:val="28"/>
+          <w:szCs w:val="28"/>
+        </w:rPr>
+        <w:t>Менгер</w:t>
+      </w:r>
+      <w:r>
+        <w:rPr>
+          <w:sz w:val="28"/>
+          <w:szCs w:val="28"/>
+        </w:rPr>
+        <w:t xml:space="preserve">, Джевонс, Вальрас) считаются основателями </w:t>
+      </w:r>
+      <w:r>
+        <w:rPr>
+          <w:sz w:val="28"/>
+          <w:szCs w:val="28"/>
+        </w:rPr>
+        <w:t>м</w:t>
+      </w:r>
+      <w:r>
+        <w:rPr>
+          <w:sz w:val="28"/>
+          <w:szCs w:val="28"/>
+        </w:rPr>
+        <w:t>аржинализм</w:t>
+      </w:r>
+      <w:r>
+        <w:rPr>
+          <w:sz w:val="28"/>
+          <w:szCs w:val="28"/>
+        </w:rPr>
+        <w:t>а в то время, как</w:t>
+      </w:r>
+      <w:r>
+        <w:rPr>
+          <w:sz w:val="28"/>
+          <w:szCs w:val="28"/>
+        </w:rPr>
+        <w:t xml:space="preserve"> Тюнен представитель более ранних работ, концепции которых вошли в маржинализм.</w:t>
+      </w:r>
+    </w:p>
+    <w:p>
+      <w:pPr>
+        <w:pStyle w:val="a6"/>
+        <w:numPr>
+          <w:ilvl w:val="0"/>
+          <w:numId w:val="7"/>
+        </w:numPr>
+        <w:spacing w:line="360" w:lineRule="auto"/>
+        <w:ind w:left="0" w:firstLine="851"/>
+        <w:jc w:val="both"/>
+        <w:rPr>
+          <w:sz w:val="28"/>
+          <w:szCs w:val="28"/>
+        </w:rPr>
+      </w:pPr>
+      <w:r>
+        <w:rPr>
+          <w:sz w:val="28"/>
+          <w:szCs w:val="28"/>
+        </w:rPr>
+        <w:t xml:space="preserve">В данной выборке лишним является Шмолляр: представитель «Новой» исторической школы. </w:t>
+      </w:r>
+      <w:r>
+        <w:rPr>
+          <w:sz w:val="28"/>
+          <w:szCs w:val="28"/>
+        </w:rPr>
+        <w:t>Менгер</w:t>
+      </w:r>
+      <w:r>
+        <w:rPr>
+          <w:sz w:val="28"/>
+          <w:szCs w:val="28"/>
+        </w:rPr>
+        <w:t>,</w:t>
+      </w:r>
+      <w:r>
+        <w:rPr>
+          <w:sz w:val="28"/>
+          <w:szCs w:val="28"/>
+        </w:rPr>
+        <w:t xml:space="preserve"> Бем-Баверк</w:t>
+      </w:r>
+      <w:r>
+        <w:rPr>
+          <w:sz w:val="28"/>
+          <w:szCs w:val="28"/>
+        </w:rPr>
+        <w:t xml:space="preserve"> и В</w:t>
+      </w:r>
+      <w:r>
+        <w:rPr>
+          <w:sz w:val="28"/>
+          <w:szCs w:val="28"/>
+        </w:rPr>
+        <w:t>изер</w:t>
+      </w:r>
+      <w:r>
+        <w:rPr>
+          <w:sz w:val="28"/>
+          <w:szCs w:val="28"/>
+        </w:rPr>
+        <w:t xml:space="preserve"> же представители австрийской школы.</w:t>
+      </w:r>
+    </w:p>
+    <w:p>
+      <w:pPr>
+        <w:pStyle w:val="a6"/>
+        <w:numPr>
+          <w:ilvl w:val="0"/>
+          <w:numId w:val="7"/>
+        </w:numPr>
+        <w:spacing w:line="360" w:lineRule="auto"/>
+        <w:ind w:left="0" w:firstLine="851"/>
+        <w:jc w:val="both"/>
+        <w:rPr>
+          <w:sz w:val="28"/>
+          <w:szCs w:val="28"/>
+        </w:rPr>
+      </w:pPr>
+      <w:r>
+        <w:rPr>
+          <w:sz w:val="28"/>
+          <w:szCs w:val="28"/>
+        </w:rPr>
+        <w:t xml:space="preserve">Визер является лишним, так как является представителем австрийской школы, </w:t>
+      </w:r>
+      <w:r>
+        <w:rPr>
+          <w:sz w:val="28"/>
+          <w:szCs w:val="28"/>
+        </w:rPr>
+        <w:t>Джевон</w:t>
+      </w:r>
+      <w:r>
+        <w:rPr>
+          <w:sz w:val="28"/>
+          <w:szCs w:val="28"/>
+        </w:rPr>
+        <w:t xml:space="preserve">с, </w:t>
+      </w:r>
+      <w:r>
+        <w:rPr>
+          <w:sz w:val="28"/>
+          <w:szCs w:val="28"/>
+        </w:rPr>
+        <w:t>Вальрас</w:t>
+      </w:r>
+      <w:r>
+        <w:rPr>
+          <w:sz w:val="28"/>
+          <w:szCs w:val="28"/>
+        </w:rPr>
+        <w:t xml:space="preserve"> и П</w:t>
+      </w:r>
+      <w:r>
+        <w:rPr>
+          <w:sz w:val="28"/>
+          <w:szCs w:val="28"/>
+        </w:rPr>
+        <w:t>арето</w:t>
+      </w:r>
+      <w:r>
+        <w:rPr>
+          <w:sz w:val="28"/>
+          <w:szCs w:val="28"/>
+        </w:rPr>
+        <w:t xml:space="preserve"> – представители м</w:t>
+      </w:r>
+      <w:r>
+        <w:rPr>
+          <w:sz w:val="28"/>
+          <w:szCs w:val="28"/>
+        </w:rPr>
+        <w:t>аржинализм</w:t>
+      </w:r>
+      <w:r>
+        <w:rPr>
+          <w:sz w:val="28"/>
+          <w:szCs w:val="28"/>
+        </w:rPr>
+        <w:t>а.</w:t>
+      </w:r>
+    </w:p>
+    <w:p>
+      <w:pPr>
+        <w:pStyle w:val="a6"/>
+        <w:numPr>
+          <w:ilvl w:val="0"/>
+          <w:numId w:val="7"/>
+        </w:numPr>
+        <w:spacing w:line="360" w:lineRule="auto"/>
+        <w:ind w:left="0" w:firstLine="851"/>
+        <w:jc w:val="both"/>
+        <w:rPr>
+          <w:sz w:val="28"/>
+          <w:szCs w:val="28"/>
+        </w:rPr>
+      </w:pPr>
+      <w:r>
+        <w:rPr>
+          <w:sz w:val="28"/>
+          <w:szCs w:val="28"/>
+        </w:rPr>
+        <w:t>Маршалл, Пигу и Джевонс – представители н</w:t>
+      </w:r>
+      <w:r>
+        <w:rPr>
+          <w:sz w:val="28"/>
+          <w:szCs w:val="28"/>
+        </w:rPr>
+        <w:t>еоклассическ</w:t>
+      </w:r>
+      <w:r>
+        <w:rPr>
+          <w:sz w:val="28"/>
+          <w:szCs w:val="28"/>
+        </w:rPr>
+        <w:t xml:space="preserve">ой </w:t>
+      </w:r>
+      <w:r>
+        <w:rPr>
+          <w:sz w:val="28"/>
+          <w:szCs w:val="28"/>
+        </w:rPr>
+        <w:t>экономическ</w:t>
+      </w:r>
+      <w:r>
+        <w:rPr>
+          <w:sz w:val="28"/>
+          <w:szCs w:val="28"/>
+        </w:rPr>
+        <w:t>ой</w:t>
+      </w:r>
+      <w:r>
+        <w:rPr>
+          <w:sz w:val="28"/>
+          <w:szCs w:val="28"/>
+        </w:rPr>
+        <w:t xml:space="preserve"> теори</w:t>
+      </w:r>
+      <w:r>
+        <w:rPr>
+          <w:sz w:val="28"/>
+          <w:szCs w:val="28"/>
+        </w:rPr>
+        <w:t>и, Парето разработал собственную концепцию «Эффективности по Парето». По этому причине он является лишним в списке.</w:t>
+      </w:r>
+    </w:p>
+    <w:p>
+      <w:pPr>
+        <w:pStyle w:val="a6"/>
+        <w:numPr>
+          <w:ilvl w:val="0"/>
+          <w:numId w:val="7"/>
+        </w:numPr>
+        <w:spacing w:line="360" w:lineRule="auto"/>
+        <w:ind w:left="0" w:firstLine="851"/>
+        <w:jc w:val="both"/>
+        <w:rPr>
+          <w:sz w:val="28"/>
+          <w:szCs w:val="28"/>
+        </w:rPr>
+      </w:pPr>
+      <w:r>
+        <w:rPr>
+          <w:sz w:val="28"/>
+          <w:szCs w:val="28"/>
+        </w:rPr>
+        <w:t>Давидсон</w:t>
+      </w:r>
+      <w:r>
+        <w:rPr>
+          <w:sz w:val="28"/>
+          <w:szCs w:val="28"/>
+        </w:rPr>
+        <w:t xml:space="preserve"> в данной подборке является лишним</w:t>
+      </w:r>
+      <w:r>
+        <w:rPr>
+          <w:sz w:val="28"/>
+          <w:szCs w:val="28"/>
+        </w:rPr>
+        <w:t xml:space="preserve"> - представитель </w:t>
+      </w:r>
+      <w:r>
+        <w:rPr>
+          <w:sz w:val="28"/>
+          <w:szCs w:val="28"/>
+        </w:rPr>
+        <w:t>посткейнсианской экономической школы</w:t>
+      </w:r>
+      <w:r>
+        <w:rPr>
+          <w:sz w:val="28"/>
+          <w:szCs w:val="28"/>
+        </w:rPr>
+        <w:t>. О</w:t>
+      </w:r>
+      <w:r>
+        <w:rPr>
+          <w:sz w:val="28"/>
+          <w:szCs w:val="28"/>
+        </w:rPr>
+        <w:t>стальные</w:t>
+      </w:r>
+      <w:r>
+        <w:rPr>
+          <w:sz w:val="28"/>
+          <w:szCs w:val="28"/>
+        </w:rPr>
+        <w:t xml:space="preserve"> приведенные представители</w:t>
+      </w:r>
+      <w:r>
+        <w:rPr>
+          <w:sz w:val="28"/>
+          <w:szCs w:val="28"/>
+        </w:rPr>
+        <w:t xml:space="preserve"> </w:t>
+      </w:r>
+      <w:r>
+        <w:rPr>
+          <w:sz w:val="28"/>
+          <w:szCs w:val="28"/>
+        </w:rPr>
+        <w:t xml:space="preserve">входят в Шведскую </w:t>
+      </w:r>
+      <w:r>
+        <w:rPr>
+          <w:sz w:val="28"/>
+          <w:szCs w:val="28"/>
+        </w:rPr>
+        <w:t>школ</w:t>
+      </w:r>
+      <w:r>
+        <w:rPr>
+          <w:sz w:val="28"/>
+          <w:szCs w:val="28"/>
+        </w:rPr>
+        <w:t>у</w:t>
+      </w:r>
+      <w:r>
+        <w:rPr>
+          <w:sz w:val="28"/>
+          <w:szCs w:val="28"/>
+        </w:rPr>
+        <w:t xml:space="preserve"> макроэкономики.</w:t>
+      </w:r>
+    </w:p>
+    <w:p>
+      <w:pPr>
+        <w:pStyle w:val="a6"/>
+        <w:numPr>
+          <w:ilvl w:val="0"/>
+          <w:numId w:val="7"/>
+        </w:numPr>
+        <w:spacing w:line="360" w:lineRule="auto"/>
+        <w:ind w:left="0" w:firstLine="851"/>
+        <w:jc w:val="both"/>
+        <w:rPr>
+          <w:sz w:val="28"/>
+          <w:szCs w:val="28"/>
+        </w:rPr>
+      </w:pPr>
+      <w:r>
+        <w:rPr>
+          <w:sz w:val="28"/>
+          <w:szCs w:val="28"/>
+        </w:rPr>
+        <w:t xml:space="preserve">Парето является лишним, так как является итальянским экономистом, </w:t>
+      </w:r>
+      <w:r>
+        <w:rPr>
+          <w:sz w:val="28"/>
+          <w:szCs w:val="28"/>
+        </w:rPr>
+        <w:t>Струве</w:t>
+      </w:r>
+      <w:r>
+        <w:rPr>
+          <w:sz w:val="28"/>
+          <w:szCs w:val="28"/>
+        </w:rPr>
+        <w:t xml:space="preserve">, </w:t>
+      </w:r>
+      <w:r>
+        <w:rPr>
+          <w:sz w:val="28"/>
+          <w:szCs w:val="28"/>
+        </w:rPr>
+        <w:t>Билимович</w:t>
+      </w:r>
+      <w:r>
+        <w:rPr>
+          <w:sz w:val="28"/>
+          <w:szCs w:val="28"/>
+        </w:rPr>
+        <w:t xml:space="preserve"> и</w:t>
+      </w:r>
+      <w:r>
+        <w:rPr>
+          <w:sz w:val="28"/>
+          <w:szCs w:val="28"/>
+        </w:rPr>
+        <w:t xml:space="preserve"> Слуцкий</w:t>
+      </w:r>
+      <w:r>
+        <w:rPr>
+          <w:sz w:val="28"/>
+          <w:szCs w:val="28"/>
+        </w:rPr>
+        <w:t xml:space="preserve"> являются российскими представителями</w:t>
+      </w:r>
+      <w:r>
+        <w:rPr>
+          <w:sz w:val="28"/>
+          <w:szCs w:val="28"/>
+        </w:rPr>
+        <w:t xml:space="preserve"> экономики.</w:t>
       </w:r>
     </w:p>
     <w:p>
@@ -1765,9 +2708,43 @@
         <w:jc w:val="center"/>
         <w:rPr>
           <w:sz w:val="28"/>
-          <w:szCs w:val="28"/>
-        </w:rPr>
-      </w:pPr>
+        </w:rPr>
+      </w:pPr>
+      <w:r>
+        <w:rPr>
+          <w:sz w:val="28"/>
+        </w:rPr>
+        <w:t>ЗАДАНИЕ 6.</w:t>
+      </w:r>
+    </w:p>
+    <w:p>
+      <w:pPr>
+        <w:spacing w:line="360" w:lineRule="auto"/>
+        <w:ind w:firstLine="709"/>
+        <w:jc w:val="both"/>
+        <w:rPr>
+          <w:sz w:val="28"/>
+        </w:rPr>
+      </w:pPr>
+      <w:r>
+        <w:rPr>
+          <w:sz w:val="28"/>
+        </w:rPr>
+        <w:lastRenderedPageBreak/>
+        <w:t>Раскрыть</w:t>
+      </w:r>
+      <w:r>
+        <w:rPr>
+          <w:sz w:val="28"/>
+        </w:rPr>
+        <w:t xml:space="preserve"> содержание методов экономической науки на конкретных примерах</w:t>
+      </w:r>
+      <w:r>
+        <w:rPr>
+          <w:sz w:val="28"/>
+        </w:rPr>
+        <w:t>.</w:t>
+      </w:r>
     </w:p>
     <w:p>
       <w:pPr>
@@ -1781,7 +2758,7 @@
         <w:rPr>
           <w:sz w:val="28"/>
         </w:rPr>
-        <w:t>ЗАДАНИЕ 5.</w:t>
+        <w:t>ВЫПОЛНЕНИЕ РАБОТЫ:</w:t>
       </w:r>
     </w:p>
     <w:p>
@@ -1797,26 +2774,492 @@
         <w:rPr>
           <w:sz w:val="28"/>
         </w:rPr>
+        <w:t>Здесь будет ответ =)</w:t>
+      </w:r>
+    </w:p>
+    <w:p>
+      <w:pPr>
+        <w:spacing w:line="360" w:lineRule="auto"/>
+        <w:jc w:val="center"/>
+        <w:rPr>
+          <w:sz w:val="28"/>
+        </w:rPr>
+      </w:pPr>
+      <w:r>
+        <w:rPr>
+          <w:sz w:val="28"/>
+        </w:rPr>
+        <w:t>ЗАДАНИЕ 7.</w:t>
+      </w:r>
+    </w:p>
+    <w:p>
+      <w:pPr>
+        <w:spacing w:line="360" w:lineRule="auto"/>
+        <w:ind w:firstLine="709"/>
+        <w:jc w:val="both"/>
+        <w:rPr>
+          <w:sz w:val="28"/>
+        </w:rPr>
+      </w:pPr>
+      <w:r>
+        <w:rPr>
+          <w:sz w:val="28"/>
+        </w:rPr>
+        <w:t>Заполнить приведенный</w:t>
+      </w:r>
+      <w:r>
+        <w:rPr>
+          <w:sz w:val="28"/>
+        </w:rPr>
+        <w:t xml:space="preserve"> глоссарий</w:t>
+      </w:r>
+      <w:r>
+        <w:rPr>
+          <w:sz w:val="28"/>
+        </w:rPr>
+        <w:t>.</w:t>
+      </w:r>
+    </w:p>
+    <w:p>
+      <w:pPr>
+        <w:spacing w:line="360" w:lineRule="auto"/>
+        <w:jc w:val="center"/>
+        <w:rPr>
+          <w:sz w:val="28"/>
+        </w:rPr>
+      </w:pPr>
+      <w:r>
+        <w:rPr>
+          <w:sz w:val="28"/>
+        </w:rPr>
+        <w:t>ВЫПОЛНЕНИЕ РАБОТЫ:</w:t>
+      </w:r>
+    </w:p>
+    <w:p>
+      <w:pPr>
+        <w:pStyle w:val="a6"/>
+        <w:numPr>
+          <w:ilvl w:val="0"/>
+          <w:numId w:val="8"/>
+        </w:numPr>
+        <w:spacing w:line="360" w:lineRule="auto"/>
+        <w:ind w:left="0" w:firstLine="851"/>
+        <w:jc w:val="both"/>
+        <w:rPr>
+          <w:sz w:val="28"/>
+        </w:rPr>
+      </w:pPr>
+      <w:r>
+        <w:rPr>
+          <w:sz w:val="28"/>
+        </w:rPr>
+        <w:t>Предмет учебной дисциплины «Экономика»</w:t>
+      </w:r>
+      <w:r>
+        <w:rPr>
+          <w:sz w:val="28"/>
+        </w:rPr>
+        <w:t xml:space="preserve"> - </w:t>
+      </w:r>
+      <w:r>
+        <w:rPr>
+          <w:sz w:val="28"/>
+        </w:rPr>
+        <w:t>проблема</w:t>
+      </w:r>
+      <w:r>
+        <w:rPr>
+          <w:sz w:val="28"/>
+        </w:rPr>
+        <w:t xml:space="preserve"> </w:t>
+      </w:r>
+      <w:r>
+        <w:rPr>
+          <w:sz w:val="28"/>
+        </w:rPr>
+        <w:t xml:space="preserve">удовлетворения потребностей в условиях ограниченности ресурсов. </w:t>
+      </w:r>
+    </w:p>
+    <w:p>
+      <w:pPr>
+        <w:pStyle w:val="a6"/>
+        <w:numPr>
+          <w:ilvl w:val="0"/>
+          <w:numId w:val="8"/>
+        </w:numPr>
+        <w:spacing w:line="360" w:lineRule="auto"/>
+        <w:ind w:left="0" w:firstLine="851"/>
+        <w:jc w:val="both"/>
+        <w:rPr>
+          <w:sz w:val="28"/>
+        </w:rPr>
+      </w:pPr>
+      <w:r>
+        <w:rPr>
+          <w:sz w:val="28"/>
+        </w:rPr>
+        <w:t xml:space="preserve">Меркантилизм </w:t>
+      </w:r>
+      <w:r>
+        <w:rPr>
+          <w:sz w:val="28"/>
+        </w:rPr>
+        <w:t>–</w:t>
+      </w:r>
+      <w:r>
+        <w:rPr>
+          <w:sz w:val="28"/>
+        </w:rPr>
+        <w:t xml:space="preserve"> </w:t>
+      </w:r>
+      <w:r>
+        <w:rPr>
+          <w:sz w:val="28"/>
+        </w:rPr>
+        <w:t>ранняя школа экономики, основанная на идее, согласно которой богатство страны достигается путем внешней торговли, накопления драгоценных металлов и через активной государственное вмешательство.</w:t>
+      </w:r>
+    </w:p>
+    <w:p>
+      <w:pPr>
+        <w:pStyle w:val="a6"/>
+        <w:numPr>
+          <w:ilvl w:val="0"/>
+          <w:numId w:val="8"/>
+        </w:numPr>
+        <w:spacing w:line="360" w:lineRule="auto"/>
+        <w:ind w:left="0" w:firstLine="851"/>
+        <w:jc w:val="both"/>
+        <w:rPr>
+          <w:sz w:val="28"/>
+        </w:rPr>
+      </w:pPr>
+      <w:r>
+        <w:rPr>
+          <w:sz w:val="28"/>
+        </w:rPr>
+        <w:t>Физиократы</w:t>
+      </w:r>
+      <w:r>
+        <w:rPr>
+          <w:sz w:val="28"/>
+        </w:rPr>
+        <w:t xml:space="preserve"> – экономическая школа, согласно которой единственным источником богатства является сельской хозяйство. Остальные сферы жизни деятельности должны получать минимум для проживания.</w:t>
+      </w:r>
+    </w:p>
+    <w:p>
+      <w:pPr>
+        <w:pStyle w:val="a6"/>
+        <w:numPr>
+          <w:ilvl w:val="0"/>
+          <w:numId w:val="8"/>
+        </w:numPr>
+        <w:spacing w:line="360" w:lineRule="auto"/>
+        <w:ind w:left="0" w:firstLine="851"/>
+        <w:jc w:val="both"/>
+        <w:rPr>
+          <w:sz w:val="28"/>
+        </w:rPr>
+      </w:pPr>
+      <w:r>
+        <w:rPr>
+          <w:sz w:val="28"/>
+        </w:rPr>
+        <w:t>Школа классической политической экономики</w:t>
+      </w:r>
+      <w:r>
+        <w:rPr>
+          <w:sz w:val="28"/>
+        </w:rPr>
+        <w:t xml:space="preserve"> </w:t>
+      </w:r>
+      <w:r>
+        <w:rPr>
+          <w:sz w:val="28"/>
+        </w:rPr>
+        <w:t>–</w:t>
+      </w:r>
+      <w:r>
+        <w:rPr>
+          <w:sz w:val="28"/>
+        </w:rPr>
+        <w:t xml:space="preserve"> </w:t>
+      </w:r>
+      <w:r>
+        <w:rPr>
+          <w:sz w:val="28"/>
+        </w:rPr>
+        <w:t>направление экономики, в основу которого были заложены идеи свободного рынка, конкуренции и законы.</w:t>
+      </w:r>
+    </w:p>
+    <w:p>
+      <w:pPr>
+        <w:pStyle w:val="a6"/>
+        <w:numPr>
+          <w:ilvl w:val="0"/>
+          <w:numId w:val="8"/>
+        </w:numPr>
+        <w:spacing w:line="360" w:lineRule="auto"/>
+        <w:ind w:left="0" w:firstLine="851"/>
+        <w:jc w:val="both"/>
+        <w:rPr>
+          <w:sz w:val="28"/>
+        </w:rPr>
+      </w:pPr>
+      <w:r>
+        <w:rPr>
+          <w:sz w:val="28"/>
+        </w:rPr>
+        <w:t>Марксизм</w:t>
+      </w:r>
+      <w:r>
+        <w:rPr>
+          <w:sz w:val="28"/>
+        </w:rPr>
+        <w:t xml:space="preserve"> – комплекс учений, экономическая составляющая которого </w:t>
+      </w:r>
+      <w:r>
+        <w:rPr>
+          <w:sz w:val="28"/>
+        </w:rPr>
+        <w:t>анализирует взаимосвязь между экономикой, классовой структурой и социальными отношениями</w:t>
+      </w:r>
+      <w:r>
+        <w:rPr>
+          <w:sz w:val="28"/>
+        </w:rPr>
+        <w:t>.</w:t>
+      </w:r>
+    </w:p>
+    <w:p>
+      <w:pPr>
+        <w:pStyle w:val="a6"/>
+        <w:numPr>
+          <w:ilvl w:val="0"/>
+          <w:numId w:val="8"/>
+        </w:numPr>
+        <w:spacing w:line="360" w:lineRule="auto"/>
+        <w:ind w:left="0" w:firstLine="851"/>
+        <w:jc w:val="both"/>
+        <w:rPr>
+          <w:sz w:val="28"/>
+        </w:rPr>
+      </w:pPr>
+      <w:r>
+        <w:rPr>
+          <w:sz w:val="28"/>
+        </w:rPr>
+        <w:t>Маржинализм</w:t>
+      </w:r>
+      <w:r>
+        <w:rPr>
+          <w:sz w:val="28"/>
+        </w:rPr>
+        <w:t xml:space="preserve"> </w:t>
+      </w:r>
+      <w:r>
+        <w:rPr>
+          <w:sz w:val="28"/>
+        </w:rPr>
+        <w:t>– это направление в экономической науке, основывающееся на принципе снижающейся предельной полезности. Этот принцип заключается в том, что каждая последующая единица потребляемого блага становится все менее ценной</w:t>
+      </w:r>
+      <w:r>
+        <w:rPr>
+          <w:sz w:val="28"/>
+        </w:rPr>
+        <w:t>.</w:t>
+      </w:r>
+    </w:p>
+    <w:p>
+      <w:pPr>
+        <w:pStyle w:val="a6"/>
+        <w:numPr>
+          <w:ilvl w:val="0"/>
+          <w:numId w:val="8"/>
+        </w:numPr>
+        <w:spacing w:line="360" w:lineRule="auto"/>
+        <w:ind w:left="0" w:firstLine="851"/>
+        <w:jc w:val="both"/>
+        <w:rPr>
+          <w:sz w:val="28"/>
+        </w:rPr>
+      </w:pPr>
+      <w:r>
+        <w:rPr>
+          <w:sz w:val="28"/>
+        </w:rPr>
+        <w:t>Кейнсианство</w:t>
+      </w:r>
+      <w:r>
+        <w:rPr>
+          <w:sz w:val="28"/>
+        </w:rPr>
+        <w:t xml:space="preserve"> – это </w:t>
+      </w:r>
+      <w:r>
+        <w:rPr>
+          <w:sz w:val="28"/>
+        </w:rPr>
+        <w:t>экономическая теория, которая утверждает, что в периоды кризисов государство должно активно вмешиваться в экономику</w:t>
+      </w:r>
+      <w:r>
+        <w:rPr>
+          <w:sz w:val="28"/>
+        </w:rPr>
+        <w:t>:</w:t>
+      </w:r>
+      <w:r>
+        <w:rPr>
+          <w:sz w:val="28"/>
+        </w:rPr>
+        <w:t xml:space="preserve"> увелич</w:t>
+      </w:r>
+      <w:r>
+        <w:rPr>
+          <w:sz w:val="28"/>
+        </w:rPr>
+        <w:t>ивать</w:t>
+      </w:r>
+      <w:r>
+        <w:rPr>
+          <w:sz w:val="28"/>
+        </w:rPr>
+        <w:t xml:space="preserve"> государственны</w:t>
+      </w:r>
+      <w:r>
+        <w:rPr>
+          <w:sz w:val="28"/>
+        </w:rPr>
+        <w:t>е</w:t>
+      </w:r>
+      <w:r>
+        <w:rPr>
+          <w:sz w:val="28"/>
+        </w:rPr>
+        <w:t xml:space="preserve"> расход</w:t>
+      </w:r>
+      <w:r>
+        <w:rPr>
+          <w:sz w:val="28"/>
+        </w:rPr>
+        <w:t>ы</w:t>
+      </w:r>
+      <w:r>
+        <w:rPr>
+          <w:sz w:val="28"/>
+        </w:rPr>
+        <w:t>, расшир</w:t>
+      </w:r>
+      <w:r>
+        <w:rPr>
+          <w:sz w:val="28"/>
+        </w:rPr>
+        <w:t>ять</w:t>
+      </w:r>
+      <w:r>
+        <w:rPr>
+          <w:sz w:val="28"/>
+        </w:rPr>
+        <w:t xml:space="preserve"> общественны</w:t>
+      </w:r>
+      <w:r>
+        <w:rPr>
+          <w:sz w:val="28"/>
+        </w:rPr>
+        <w:t>е</w:t>
+      </w:r>
+      <w:r>
+        <w:rPr>
+          <w:sz w:val="28"/>
+        </w:rPr>
+        <w:t xml:space="preserve"> </w:t>
+      </w:r>
+      <w:r>
+        <w:rPr>
+          <w:sz w:val="28"/>
+        </w:rPr>
         <w:lastRenderedPageBreak/>
-        <w:t>Определить</w:t>
-      </w:r>
-      <w:r>
-        <w:rPr>
-          <w:sz w:val="28"/>
-        </w:rPr>
-        <w:t xml:space="preserve">, кто лишний в предложенном перечне имен, где трое из четырех должны быть объединены одной школой или одной концепцией. </w:t>
-      </w:r>
-      <w:r>
-        <w:rPr>
-          <w:sz w:val="28"/>
-        </w:rPr>
-        <w:t>Охарактеризовать</w:t>
-      </w:r>
-      <w:r>
-        <w:rPr>
-          <w:sz w:val="28"/>
-        </w:rPr>
-        <w:t xml:space="preserve"> школы (концепции)</w:t>
+        <w:t>работ</w:t>
+      </w:r>
+      <w:r>
+        <w:rPr>
+          <w:sz w:val="28"/>
+        </w:rPr>
+        <w:t>ы</w:t>
+      </w:r>
+      <w:r>
+        <w:rPr>
+          <w:sz w:val="28"/>
+        </w:rPr>
+        <w:t xml:space="preserve"> и поддерж</w:t>
+      </w:r>
+      <w:r>
+        <w:rPr>
+          <w:sz w:val="28"/>
+        </w:rPr>
+        <w:t>ивать</w:t>
+      </w:r>
+      <w:r>
+        <w:rPr>
+          <w:sz w:val="28"/>
+        </w:rPr>
+        <w:t xml:space="preserve"> покупательн</w:t>
+      </w:r>
+      <w:r>
+        <w:rPr>
+          <w:sz w:val="28"/>
+        </w:rPr>
+        <w:t>ую</w:t>
+      </w:r>
+      <w:r>
+        <w:rPr>
+          <w:sz w:val="28"/>
+        </w:rPr>
+        <w:t xml:space="preserve"> способност</w:t>
+      </w:r>
+      <w:r>
+        <w:rPr>
+          <w:sz w:val="28"/>
+        </w:rPr>
+        <w:t>ь</w:t>
+      </w:r>
+      <w:r>
+        <w:rPr>
+          <w:sz w:val="28"/>
+        </w:rPr>
+        <w:t xml:space="preserve"> населения. </w:t>
+      </w:r>
+    </w:p>
+    <w:p>
+      <w:pPr>
+        <w:pStyle w:val="a6"/>
+        <w:numPr>
+          <w:ilvl w:val="0"/>
+          <w:numId w:val="8"/>
+        </w:numPr>
+        <w:spacing w:line="360" w:lineRule="auto"/>
+        <w:ind w:left="0" w:firstLine="851"/>
+        <w:jc w:val="both"/>
+        <w:rPr>
+          <w:sz w:val="28"/>
+        </w:rPr>
+      </w:pPr>
+      <w:r>
+        <w:rPr>
+          <w:sz w:val="28"/>
+        </w:rPr>
+        <w:t>Монетаризм</w:t>
+      </w:r>
+      <w:r>
+        <w:rPr>
+          <w:sz w:val="28"/>
+        </w:rPr>
+        <w:t xml:space="preserve"> – макроэкономическая теория, </w:t>
+      </w:r>
+      <w:r>
+        <w:rPr>
+          <w:sz w:val="28"/>
+        </w:rPr>
+        <w:t>согласно которой количество денег в обращении является определяющим фактором развития экономики</w:t>
       </w:r>
       <w:r>
         <w:rPr>
@@ -1827,17 +3270,308 @@
     </w:p>
     <w:p>
       <w:pPr>
+        <w:pStyle w:val="a6"/>
+        <w:numPr>
+          <w:ilvl w:val="0"/>
+          <w:numId w:val="8"/>
+        </w:numPr>
+        <w:spacing w:line="360" w:lineRule="auto"/>
+        <w:ind w:left="0" w:firstLine="851"/>
+        <w:jc w:val="both"/>
+        <w:rPr>
+          <w:sz w:val="28"/>
+        </w:rPr>
+      </w:pPr>
+      <w:r>
+        <w:rPr>
+          <w:sz w:val="28"/>
+        </w:rPr>
+        <w:t>Микроэкономика</w:t>
+      </w:r>
+      <w:r>
+        <w:rPr>
+          <w:sz w:val="28"/>
+        </w:rPr>
+        <w:t xml:space="preserve"> –</w:t>
+      </w:r>
+      <w:r>
+        <w:rPr>
+          <w:sz w:val="28"/>
+        </w:rPr>
+        <w:t> </w:t>
+      </w:r>
+      <w:r>
+        <w:rPr>
+          <w:sz w:val="28"/>
+        </w:rPr>
+        <w:t xml:space="preserve">это </w:t>
+      </w:r>
+      <w:r>
+        <w:rPr>
+          <w:sz w:val="28"/>
+        </w:rPr>
+        <w:t>направление экономической науки, в рамках которого исследуются взаимоотношения между рыночными секторами, хозяйствующими субъектами и потребителями</w:t>
+      </w:r>
+    </w:p>
+    <w:p>
+      <w:pPr>
+        <w:pStyle w:val="a6"/>
+        <w:numPr>
+          <w:ilvl w:val="0"/>
+          <w:numId w:val="8"/>
+        </w:numPr>
+        <w:spacing w:line="360" w:lineRule="auto"/>
+        <w:ind w:left="0" w:firstLine="851"/>
+        <w:jc w:val="both"/>
+        <w:rPr>
+          <w:sz w:val="28"/>
+        </w:rPr>
+      </w:pPr>
+      <w:r>
+        <w:rPr>
+          <w:sz w:val="28"/>
+        </w:rPr>
+        <w:t>Макроэкономика</w:t>
+      </w:r>
+      <w:r>
+        <w:rPr>
+          <w:sz w:val="28"/>
+        </w:rPr>
+        <w:t xml:space="preserve"> – это раздел </w:t>
+      </w:r>
+      <w:r>
+        <w:rPr>
+          <w:sz w:val="28"/>
+        </w:rPr>
+        <w:t xml:space="preserve">экономической науки, изучающий экономику в целом, как единое целое, на уровне государства </w:t>
+      </w:r>
+      <w:r>
+        <w:rPr>
+          <w:sz w:val="28"/>
+        </w:rPr>
+        <w:t>или всего мира.</w:t>
+      </w:r>
+      <w:r>
+        <w:rPr>
+          <w:sz w:val="28"/>
+        </w:rPr>
+        <w:t> </w:t>
+      </w:r>
+    </w:p>
+    <w:p>
+      <w:pPr>
+        <w:pStyle w:val="a6"/>
+        <w:numPr>
+          <w:ilvl w:val="0"/>
+          <w:numId w:val="8"/>
+        </w:numPr>
+        <w:spacing w:line="360" w:lineRule="auto"/>
+        <w:ind w:left="0" w:firstLine="851"/>
+        <w:jc w:val="both"/>
+        <w:rPr>
+          <w:sz w:val="28"/>
+        </w:rPr>
+      </w:pPr>
+      <w:r>
+        <w:rPr>
+          <w:sz w:val="28"/>
+        </w:rPr>
+        <w:t>Политическая экономика</w:t>
+      </w:r>
+      <w:r>
+        <w:rPr>
+          <w:sz w:val="28"/>
+        </w:rPr>
+        <w:t xml:space="preserve"> – это </w:t>
+      </w:r>
+      <w:r>
+        <w:rPr>
+          <w:sz w:val="28"/>
+        </w:rPr>
+        <w:t>одна из </w:t>
+      </w:r>
+      <w:hyperlink r:id="rId7" w:tooltip="Общественные науки" w:history="1">
+        <w:r>
+          <w:rPr>
+            <w:sz w:val="28"/>
+          </w:rPr>
+          <w:t>общественных наук</w:t>
+        </w:r>
+      </w:hyperlink>
+      <w:r>
+        <w:rPr>
+          <w:sz w:val="28"/>
+        </w:rPr>
+        <w:t>, предметом исследования которой являются отношения между </w:t>
+      </w:r>
+      <w:hyperlink r:id="rId8" w:tooltip="Рынок" w:history="1">
+        <w:r>
+          <w:rPr>
+            <w:sz w:val="28"/>
+          </w:rPr>
+          <w:t>рынком</w:t>
+        </w:r>
+      </w:hyperlink>
+      <w:r>
+        <w:rPr>
+          <w:sz w:val="28"/>
+        </w:rPr>
+        <w:t> и </w:t>
+      </w:r>
+      <w:hyperlink r:id="rId9" w:tooltip="Государство" w:history="1">
+        <w:r>
+          <w:rPr>
+            <w:sz w:val="28"/>
+          </w:rPr>
+          <w:t>государством</w:t>
+        </w:r>
+      </w:hyperlink>
+      <w:r>
+        <w:rPr>
+          <w:sz w:val="28"/>
+        </w:rPr>
+        <w:t>, </w:t>
+      </w:r>
+      <w:hyperlink r:id="rId10" w:tooltip="Индивид" w:history="1">
+        <w:r>
+          <w:rPr>
+            <w:sz w:val="28"/>
+          </w:rPr>
+          <w:t>индивидом</w:t>
+        </w:r>
+      </w:hyperlink>
+      <w:r>
+        <w:rPr>
+          <w:sz w:val="28"/>
+        </w:rPr>
+        <w:t> и </w:t>
+      </w:r>
+      <w:hyperlink r:id="rId11" w:tooltip="Общество" w:history="1">
+        <w:r>
+          <w:rPr>
+            <w:sz w:val="28"/>
+          </w:rPr>
+          <w:t>обществом</w:t>
+        </w:r>
+      </w:hyperlink>
+      <w:r>
+        <w:rPr>
+          <w:sz w:val="28"/>
+        </w:rPr>
+        <w:t>.</w:t>
+      </w:r>
+    </w:p>
+    <w:p>
+      <w:pPr>
+        <w:pStyle w:val="a6"/>
+        <w:numPr>
+          <w:ilvl w:val="0"/>
+          <w:numId w:val="8"/>
+        </w:numPr>
+        <w:spacing w:line="360" w:lineRule="auto"/>
+        <w:ind w:left="0" w:firstLine="851"/>
+        <w:jc w:val="both"/>
+        <w:rPr>
+          <w:sz w:val="28"/>
+        </w:rPr>
+      </w:pPr>
+      <w:r>
+        <w:rPr>
+          <w:sz w:val="28"/>
+        </w:rPr>
+        <w:t>Экономические законы</w:t>
+      </w:r>
+      <w:r>
+        <w:rPr>
+          <w:sz w:val="28"/>
+        </w:rPr>
+        <w:t xml:space="preserve"> – </w:t>
+      </w:r>
+      <w:r>
+        <w:rPr>
+          <w:sz w:val="28"/>
+        </w:rPr>
+        <w:t>это существенное, необходимое, устойчивое отношение в экономических явлениях и процессах, определяющее их развитие.</w:t>
+      </w:r>
+    </w:p>
+    <w:p>
+      <w:pPr>
+        <w:pStyle w:val="a6"/>
+        <w:numPr>
+          <w:ilvl w:val="0"/>
+          <w:numId w:val="8"/>
+        </w:numPr>
+        <w:spacing w:line="360" w:lineRule="auto"/>
+        <w:ind w:left="0" w:firstLine="851"/>
+        <w:jc w:val="both"/>
+        <w:rPr>
+          <w:sz w:val="28"/>
+        </w:rPr>
+      </w:pPr>
+      <w:r>
+        <w:rPr>
+          <w:sz w:val="28"/>
+        </w:rPr>
+        <w:t>Методы экономической науки</w:t>
+      </w:r>
+      <w:r>
+        <w:rPr>
+          <w:sz w:val="28"/>
+        </w:rPr>
+        <w:t xml:space="preserve"> – э</w:t>
+      </w:r>
+      <w:r>
+        <w:rPr>
+          <w:sz w:val="28"/>
+        </w:rPr>
+        <w:t>то</w:t>
+      </w:r>
+      <w:r>
+        <w:rPr>
+          <w:sz w:val="28"/>
+        </w:rPr>
+        <w:t xml:space="preserve"> </w:t>
+      </w:r>
+      <w:r>
+        <w:rPr>
+          <w:sz w:val="28"/>
+        </w:rPr>
+        <w:t>наука о методах</w:t>
+      </w:r>
+      <w:r>
+        <w:rPr>
+          <w:sz w:val="28"/>
+        </w:rPr>
+        <w:t xml:space="preserve"> или их совокупности</w:t>
+      </w:r>
+      <w:r>
+        <w:rPr>
+          <w:sz w:val="28"/>
+        </w:rPr>
+        <w:t xml:space="preserve"> исследования экономических явлени</w:t>
+      </w:r>
+      <w:r>
+        <w:rPr>
+          <w:sz w:val="28"/>
+        </w:rPr>
+        <w:t>й.</w:t>
+      </w:r>
+    </w:p>
+    <w:p>
+      <w:pPr>
         <w:spacing w:line="360" w:lineRule="auto"/>
         <w:jc w:val="center"/>
         <w:rPr>
           <w:sz w:val="28"/>
-        </w:rPr>
-      </w:pPr>
-      <w:r>
-        <w:rPr>
-          <w:sz w:val="28"/>
-        </w:rPr>
-        <w:t>ВЫПОЛНЕНИЕ РАБОТЫ:</w:t>
+          <w:szCs w:val="28"/>
+        </w:rPr>
+      </w:pPr>
+      <w:r>
+        <w:rPr>
+          <w:sz w:val="28"/>
+          <w:szCs w:val="28"/>
+        </w:rPr>
+        <w:t>ВЫВОД К РАБОТЕ:</w:t>
       </w:r>
     </w:p>
     <w:p>
@@ -1853,59 +3587,25 @@
         <w:rPr>
           <w:sz w:val="28"/>
         </w:rPr>
-        <w:t>Для выполнение данной работы была выбрана тема «Аренда виртуального сервера (</w:t>
-      </w:r>
-      <w:r>
-        <w:rPr>
-          <w:sz w:val="28"/>
-          <w:lang w:val="en-US"/>
-        </w:rPr>
-        <w:t>VPS</w:t>
-      </w:r>
-      <w:r>
-        <w:rPr>
-          <w:sz w:val="28"/>
-        </w:rPr>
-        <w:t xml:space="preserve">)», использовалась программа </w:t>
-      </w:r>
-      <w:r>
-        <w:rPr>
-          <w:sz w:val="28"/>
-          <w:lang w:val="en-US"/>
-        </w:rPr>
-        <w:t>All</w:t>
-      </w:r>
-      <w:r>
-        <w:rPr>
-          <w:sz w:val="28"/>
-        </w:rPr>
-        <w:t xml:space="preserve"> </w:t>
-      </w:r>
-      <w:r>
-        <w:rPr>
-          <w:sz w:val="28"/>
-          <w:lang w:val="en-US"/>
-        </w:rPr>
-        <w:t>Fusion</w:t>
-      </w:r>
-      <w:r>
-        <w:rPr>
-          <w:sz w:val="28"/>
-        </w:rPr>
-        <w:t xml:space="preserve"> </w:t>
-      </w:r>
-      <w:r>
-        <w:rPr>
-          <w:sz w:val="28"/>
-          <w:lang w:val="en-US"/>
-        </w:rPr>
-        <w:t>PM</w:t>
-      </w:r>
-      <w:r>
-        <w:rPr>
-          <w:sz w:val="28"/>
-        </w:rPr>
-        <w:t xml:space="preserve"> 8</w:t>
+        <w:t>Я изучил и узнал и</w:t>
+      </w:r>
+      <w:r>
+        <w:rPr>
+          <w:sz w:val="28"/>
+        </w:rPr>
+        <w:t>стори</w:t>
+      </w:r>
+      <w:r>
+        <w:rPr>
+          <w:sz w:val="28"/>
+        </w:rPr>
+        <w:t>ю</w:t>
+      </w:r>
+      <w:r>
+        <w:rPr>
+          <w:sz w:val="28"/>
+        </w:rPr>
+        <w:t xml:space="preserve"> возникновения, предмет и методы экономической науки</w:t>
       </w:r>
       <w:r>
         <w:rPr>
@@ -1914,452 +3614,10 @@
         <w:t>.</w:t>
       </w:r>
     </w:p>
-    <w:p>
-      <w:pPr>
-        <w:pStyle w:val="a8"/>
-        <w:rPr>
-          <w:sz w:val="28"/>
-          <w:szCs w:val="28"/>
-          <w:lang w:val="ru-RU"/>
-        </w:rPr>
-      </w:pPr>
-    </w:p>
-    <w:p>
-      <w:pPr>
-        <w:spacing w:line="360" w:lineRule="auto"/>
-        <w:jc w:val="center"/>
-        <w:rPr>
-          <w:sz w:val="28"/>
-          <w:szCs w:val="28"/>
-        </w:rPr>
-      </w:pPr>
-      <w:r>
-        <w:rPr>
-          <w:sz w:val="28"/>
-          <w:szCs w:val="28"/>
-        </w:rPr>
-        <w:t>Рисунок 1. Выполнение операции с отрицательными числами.</w:t>
-      </w:r>
-    </w:p>
-    <w:p>
-      <w:pPr>
-        <w:spacing w:line="360" w:lineRule="auto"/>
-        <w:jc w:val="center"/>
-        <w:rPr>
-          <w:sz w:val="28"/>
-          <w:szCs w:val="28"/>
-        </w:rPr>
-      </w:pPr>
-    </w:p>
-    <w:p>
-      <w:pPr>
-        <w:spacing w:line="360" w:lineRule="auto"/>
-        <w:jc w:val="center"/>
-        <w:rPr>
-          <w:sz w:val="28"/>
-        </w:rPr>
-      </w:pPr>
-      <w:r>
-        <w:rPr>
-          <w:sz w:val="28"/>
-        </w:rPr>
-        <w:t>ЗАДАНИЕ 6.</w:t>
-      </w:r>
-    </w:p>
-    <w:p>
-      <w:pPr>
-        <w:spacing w:line="360" w:lineRule="auto"/>
-        <w:ind w:firstLine="709"/>
-        <w:jc w:val="both"/>
-        <w:rPr>
-          <w:sz w:val="28"/>
-        </w:rPr>
-      </w:pPr>
-      <w:r>
-        <w:rPr>
-          <w:sz w:val="28"/>
-        </w:rPr>
-        <w:t>Раскрыть</w:t>
-      </w:r>
-      <w:r>
-        <w:rPr>
-          <w:sz w:val="28"/>
-        </w:rPr>
-        <w:t xml:space="preserve"> содержание методов экономической науки на конкретных примерах</w:t>
-      </w:r>
-      <w:r>
-        <w:rPr>
-          <w:sz w:val="28"/>
-        </w:rPr>
-        <w:t>.</w:t>
-      </w:r>
-    </w:p>
-    <w:p>
-      <w:pPr>
-        <w:spacing w:line="360" w:lineRule="auto"/>
-        <w:jc w:val="center"/>
-        <w:rPr>
-          <w:sz w:val="28"/>
-        </w:rPr>
-      </w:pPr>
-      <w:r>
-        <w:rPr>
-          <w:sz w:val="28"/>
-        </w:rPr>
-        <w:t>ВЫПОЛНЕНИЕ РАБОТЫ:</w:t>
-      </w:r>
-    </w:p>
-    <w:p>
-      <w:pPr>
-        <w:spacing w:line="360" w:lineRule="auto"/>
-        <w:ind w:firstLine="709"/>
-        <w:jc w:val="both"/>
-        <w:rPr>
-          <w:sz w:val="28"/>
-        </w:rPr>
-      </w:pPr>
-      <w:r>
-        <w:rPr>
-          <w:sz w:val="28"/>
-        </w:rPr>
-        <w:t>Для выполнение данной работы была выбрана тема «Аренда виртуального сервера (</w:t>
-      </w:r>
-      <w:r>
-        <w:rPr>
-          <w:sz w:val="28"/>
-          <w:lang w:val="en-US"/>
-        </w:rPr>
-        <w:t>VPS</w:t>
-      </w:r>
-      <w:r>
-        <w:rPr>
-          <w:sz w:val="28"/>
-        </w:rPr>
-        <w:t xml:space="preserve">)», использовалась программа </w:t>
-      </w:r>
-      <w:r>
-        <w:rPr>
-          <w:sz w:val="28"/>
-          <w:lang w:val="en-US"/>
-        </w:rPr>
-        <w:t>All</w:t>
-      </w:r>
-      <w:r>
-        <w:rPr>
-          <w:sz w:val="28"/>
-        </w:rPr>
-        <w:t xml:space="preserve"> </w:t>
-      </w:r>
-      <w:r>
-        <w:rPr>
-          <w:sz w:val="28"/>
-          <w:lang w:val="en-US"/>
-        </w:rPr>
-        <w:t>Fusion</w:t>
-      </w:r>
-      <w:r>
-        <w:rPr>
-          <w:sz w:val="28"/>
-        </w:rPr>
-        <w:t xml:space="preserve"> </w:t>
-      </w:r>
-      <w:r>
-        <w:rPr>
-          <w:sz w:val="28"/>
-          <w:lang w:val="en-US"/>
-        </w:rPr>
-        <w:t>PM</w:t>
-      </w:r>
-      <w:r>
-        <w:rPr>
-          <w:sz w:val="28"/>
-        </w:rPr>
-        <w:t xml:space="preserve"> 8</w:t>
-      </w:r>
-      <w:r>
-        <w:rPr>
-          <w:sz w:val="28"/>
-        </w:rPr>
-        <w:t>.</w:t>
-      </w:r>
-    </w:p>
-    <w:p>
-      <w:pPr>
-        <w:pStyle w:val="a8"/>
-        <w:rPr>
-          <w:sz w:val="28"/>
-          <w:szCs w:val="28"/>
-          <w:lang w:val="ru-RU"/>
-        </w:rPr>
-      </w:pPr>
-    </w:p>
-    <w:p>
-      <w:pPr>
-        <w:spacing w:line="360" w:lineRule="auto"/>
-        <w:jc w:val="center"/>
-        <w:rPr>
-          <w:sz w:val="28"/>
-          <w:szCs w:val="28"/>
-        </w:rPr>
-      </w:pPr>
-      <w:r>
-        <w:rPr>
-          <w:sz w:val="28"/>
-          <w:szCs w:val="28"/>
-        </w:rPr>
-        <w:t>Рисунок 1. Выполнение операции с отрицательными числами.</w:t>
-      </w:r>
-    </w:p>
-    <w:p>
-      <w:pPr>
-        <w:spacing w:line="360" w:lineRule="auto"/>
-        <w:jc w:val="center"/>
-        <w:rPr>
-          <w:sz w:val="28"/>
-          <w:szCs w:val="28"/>
-        </w:rPr>
-      </w:pPr>
-    </w:p>
-    <w:p>
-      <w:pPr>
-        <w:spacing w:line="360" w:lineRule="auto"/>
-        <w:jc w:val="center"/>
-        <w:rPr>
-          <w:sz w:val="28"/>
-        </w:rPr>
-      </w:pPr>
-      <w:r>
-        <w:rPr>
-          <w:sz w:val="28"/>
-        </w:rPr>
-        <w:t>ЗАДАНИЕ 7.</w:t>
-      </w:r>
-    </w:p>
-    <w:p>
-      <w:pPr>
-        <w:spacing w:line="360" w:lineRule="auto"/>
-        <w:ind w:firstLine="709"/>
-        <w:jc w:val="both"/>
-        <w:rPr>
-          <w:sz w:val="28"/>
-        </w:rPr>
-      </w:pPr>
-      <w:r>
-        <w:rPr>
-          <w:sz w:val="28"/>
-        </w:rPr>
-        <w:t>Заполнить приведенный</w:t>
-      </w:r>
-      <w:r>
-        <w:rPr>
-          <w:sz w:val="28"/>
-        </w:rPr>
-        <w:t xml:space="preserve"> глоссарий</w:t>
-      </w:r>
-      <w:r>
-        <w:rPr>
-          <w:sz w:val="28"/>
-        </w:rPr>
-        <w:t>.</w:t>
-      </w:r>
-    </w:p>
-    <w:p>
-      <w:pPr>
-        <w:spacing w:line="360" w:lineRule="auto"/>
-        <w:jc w:val="center"/>
-        <w:rPr>
-          <w:sz w:val="28"/>
-        </w:rPr>
-      </w:pPr>
-      <w:r>
-        <w:rPr>
-          <w:sz w:val="28"/>
-        </w:rPr>
-        <w:t>ВЫПОЛНЕНИЕ РАБОТЫ:</w:t>
-      </w:r>
-    </w:p>
-    <w:p>
-      <w:pPr>
-        <w:spacing w:line="360" w:lineRule="auto"/>
-        <w:ind w:firstLine="709"/>
-        <w:jc w:val="both"/>
-        <w:rPr>
-          <w:sz w:val="28"/>
-        </w:rPr>
-      </w:pPr>
-      <w:r>
-        <w:rPr>
-          <w:sz w:val="28"/>
-        </w:rPr>
-        <w:t>Для выполнение данной работы была выбрана тема «Аренда виртуального сервера (</w:t>
-      </w:r>
-      <w:r>
-        <w:rPr>
-          <w:sz w:val="28"/>
-          <w:lang w:val="en-US"/>
-        </w:rPr>
-        <w:t>VPS</w:t>
-      </w:r>
-      <w:r>
-        <w:rPr>
-          <w:sz w:val="28"/>
-        </w:rPr>
-        <w:t xml:space="preserve">)», использовалась программа </w:t>
-      </w:r>
-      <w:r>
-        <w:rPr>
-          <w:sz w:val="28"/>
-          <w:lang w:val="en-US"/>
-        </w:rPr>
-        <w:t>All</w:t>
-      </w:r>
-      <w:r>
-        <w:rPr>
-          <w:sz w:val="28"/>
-        </w:rPr>
-        <w:t xml:space="preserve"> </w:t>
-      </w:r>
-      <w:r>
-        <w:rPr>
-          <w:sz w:val="28"/>
-          <w:lang w:val="en-US"/>
-        </w:rPr>
-        <w:t>Fusion</w:t>
-      </w:r>
-      <w:r>
-        <w:rPr>
-          <w:sz w:val="28"/>
-        </w:rPr>
-        <w:t xml:space="preserve"> </w:t>
-      </w:r>
-      <w:r>
-        <w:rPr>
-          <w:sz w:val="28"/>
-          <w:lang w:val="en-US"/>
-        </w:rPr>
-        <w:t>PM</w:t>
-      </w:r>
-      <w:r>
-        <w:rPr>
-          <w:sz w:val="28"/>
-        </w:rPr>
-        <w:t xml:space="preserve"> 8</w:t>
-      </w:r>
-      <w:r>
-        <w:rPr>
-          <w:sz w:val="28"/>
-        </w:rPr>
-        <w:t>.</w:t>
-      </w:r>
-    </w:p>
-    <w:p>
-      <w:pPr>
-        <w:pStyle w:val="a8"/>
-        <w:rPr>
-          <w:sz w:val="28"/>
-          <w:szCs w:val="28"/>
-          <w:lang w:val="ru-RU"/>
-        </w:rPr>
-      </w:pPr>
-    </w:p>
-    <w:p>
-      <w:pPr>
-        <w:spacing w:line="360" w:lineRule="auto"/>
-        <w:jc w:val="center"/>
-        <w:rPr>
-          <w:sz w:val="28"/>
-          <w:szCs w:val="28"/>
-        </w:rPr>
-      </w:pPr>
-      <w:r>
-        <w:rPr>
-          <w:sz w:val="28"/>
-          <w:szCs w:val="28"/>
-        </w:rPr>
-        <w:t>Рисунок 1. Выполнение операции с отрицательными числами.</w:t>
-      </w:r>
-    </w:p>
-    <w:p>
-      <w:pPr>
-        <w:spacing w:line="360" w:lineRule="auto"/>
-        <w:jc w:val="center"/>
-        <w:rPr>
-          <w:sz w:val="28"/>
-          <w:szCs w:val="28"/>
-        </w:rPr>
-      </w:pPr>
-    </w:p>
-    <w:p>
-      <w:pPr>
-        <w:spacing w:line="360" w:lineRule="auto"/>
-        <w:jc w:val="center"/>
-        <w:rPr>
-          <w:sz w:val="28"/>
-          <w:szCs w:val="28"/>
-        </w:rPr>
-      </w:pPr>
-    </w:p>
-    <w:p>
-      <w:pPr>
-        <w:spacing w:line="360" w:lineRule="auto"/>
-        <w:jc w:val="center"/>
-        <w:rPr>
-          <w:sz w:val="28"/>
-          <w:szCs w:val="28"/>
-        </w:rPr>
-      </w:pPr>
-      <w:r>
-        <w:rPr>
-          <w:sz w:val="28"/>
-          <w:szCs w:val="28"/>
-        </w:rPr>
-        <w:t>ВЫВОД К РАБОТЕ:</w:t>
-      </w:r>
-    </w:p>
-    <w:p>
-      <w:pPr>
-        <w:spacing w:line="360" w:lineRule="auto"/>
-        <w:ind w:firstLine="709"/>
-        <w:jc w:val="both"/>
-        <w:rPr>
-          <w:sz w:val="28"/>
-        </w:rPr>
-      </w:pPr>
-      <w:r>
-        <w:rPr>
-          <w:sz w:val="28"/>
-        </w:rPr>
-        <w:t>Я изучил и узнал и</w:t>
-      </w:r>
-      <w:r>
-        <w:rPr>
-          <w:sz w:val="28"/>
-        </w:rPr>
-        <w:t>стори</w:t>
-      </w:r>
-      <w:r>
-        <w:rPr>
-          <w:sz w:val="28"/>
-        </w:rPr>
-        <w:t>ю</w:t>
-      </w:r>
-      <w:r>
-        <w:rPr>
-          <w:sz w:val="28"/>
-        </w:rPr>
-        <w:t xml:space="preserve"> возникновения, предмет и методы экономической науки</w:t>
-      </w:r>
-      <w:r>
-        <w:rPr>
-          <w:sz w:val="28"/>
-        </w:rPr>
-        <w:t>.</w:t>
-      </w:r>
-    </w:p>
     <w:sectPr>
-      <w:footerReference w:type="even" r:id="rId7"/>
-      <w:footerReference w:type="default" r:id="rId8"/>
-      <w:footerReference w:type="first" r:id="rId9"/>
+      <w:footerReference w:type="even" r:id="rId12"/>
+      <w:footerReference w:type="default" r:id="rId13"/>
+      <w:footerReference w:type="first" r:id="rId14"/>
       <w:pgSz w:w="11906" w:h="16838"/>
       <w:pgMar w:top="1134" w:right="850" w:bottom="1134" w:left="1701" w:header="0" w:footer="708" w:gutter="0"/>
       <w:cols w:space="720"/>
@@ -2563,6 +3821,95 @@
     </w:lvl>
   </w:abstractNum>
   <w:abstractNum w:abstractNumId="1" w15:restartNumberingAfterBreak="0">
+    <w:nsid w:val="1E846636"/>
+    <w:multiLevelType w:val="hybridMultilevel"/>
+    <w:tmpl w:val="E7A8A190"/>
+    <w:lvl w:ilvl="0" w:tplc="0419000F">
+      <w:start w:val="1"/>
+      <w:numFmt w:val="decimal"/>
+      <w:lvlText w:val="%1."/>
+      <w:lvlJc w:val="left"/>
+      <w:pPr>
+        <w:ind w:left="720" w:hanging="360"/>
+      </w:pPr>
+      <w:rPr>
+        <w:rFonts w:hint="default"/>
+      </w:rPr>
+    </w:lvl>
+    <w:lvl w:ilvl="1" w:tplc="04190019" w:tentative="1">
+      <w:start w:val="1"/>
+      <w:numFmt w:val="lowerLetter"/>
+      <w:lvlText w:val="%2."/>
+      <w:lvlJc w:val="left"/>
+      <w:pPr>
+        <w:ind w:left="1440" w:hanging="360"/>
+      </w:pPr>
+    </w:lvl>
+    <w:lvl w:ilvl="2" w:tplc="0419001B" w:tentative="1">
+      <w:start w:val="1"/>
+      <w:numFmt w:val="lowerRoman"/>
+      <w:lvlText w:val="%3."/>
+      <w:lvlJc w:val="right"/>
+      <w:pPr>
+        <w:ind w:left="2160" w:hanging="180"/>
+      </w:pPr>
+    </w:lvl>
+    <w:lvl w:ilvl="3" w:tplc="0419000F" w:tentative="1">
+      <w:start w:val="1"/>
+      <w:numFmt w:val="decimal"/>
+      <w:lvlText w:val="%4."/>
+      <w:lvlJc w:val="left"/>
+      <w:pPr>
+        <w:ind w:left="2880" w:hanging="360"/>
+      </w:pPr>
+    </w:lvl>
+    <w:lvl w:ilvl="4" w:tplc="04190019" w:tentative="1">
+      <w:start w:val="1"/>
+      <w:numFmt w:val="lowerLetter"/>
+      <w:lvlText w:val="%5."/>
+      <w:lvlJc w:val="left"/>
+      <w:pPr>
+        <w:ind w:left="3600" w:hanging="360"/>
+      </w:pPr>
+    </w:lvl>
+    <w:lvl w:ilvl="5" w:tplc="0419001B" w:tentative="1">
+      <w:start w:val="1"/>
+      <w:numFmt w:val="lowerRoman"/>
+      <w:lvlText w:val="%6."/>
+      <w:lvlJc w:val="right"/>
+      <w:pPr>
+        <w:ind w:left="4320" w:hanging="180"/>
+      </w:pPr>
+    </w:lvl>
+    <w:lvl w:ilvl="6" w:tplc="0419000F" w:tentative="1">
+      <w:start w:val="1"/>
+      <w:numFmt w:val="decimal"/>
+      <w:lvlText w:val="%7."/>
+      <w:lvlJc w:val="left"/>
+      <w:pPr>
+        <w:ind w:left="5040" w:hanging="360"/>
+      </w:pPr>
+    </w:lvl>
+    <w:lvl w:ilvl="7" w:tplc="04190019" w:tentative="1">
+      <w:start w:val="1"/>
+      <w:numFmt w:val="lowerLetter"/>
+      <w:lvlText w:val="%8."/>
+      <w:lvlJc w:val="left"/>
+      <w:pPr>
+        <w:ind w:left="5760" w:hanging="360"/>
+      </w:pPr>
+    </w:lvl>
+    <w:lvl w:ilvl="8" w:tplc="0419001B" w:tentative="1">
+      <w:start w:val="1"/>
+      <w:numFmt w:val="lowerRoman"/>
+      <w:lvlText w:val="%9."/>
+      <w:lvlJc w:val="right"/>
+      <w:pPr>
+        <w:ind w:left="6480" w:hanging="180"/>
+      </w:pPr>
+    </w:lvl>
+  </w:abstractNum>
+  <w:abstractNum w:abstractNumId="2" w15:restartNumberingAfterBreak="0">
     <w:nsid w:val="216C65F1"/>
     <w:multiLevelType w:val="hybridMultilevel"/>
     <w:tmpl w:val="D3305AE8"/>
@@ -2648,6 +3995,451 @@
       <w:lvlJc w:val="right"/>
       <w:pPr>
         <w:ind w:left="6829" w:hanging="180"/>
+      </w:pPr>
+    </w:lvl>
+  </w:abstractNum>
+  <w:abstractNum w:abstractNumId="3" w15:restartNumberingAfterBreak="0">
+    <w:nsid w:val="225D7C9B"/>
+    <w:multiLevelType w:val="hybridMultilevel"/>
+    <w:tmpl w:val="340E4314"/>
+    <w:lvl w:ilvl="0" w:tplc="BDCCD614">
+      <w:start w:val="1"/>
+      <w:numFmt w:val="decimal"/>
+      <w:lvlText w:val="%1."/>
+      <w:lvlJc w:val="left"/>
+      <w:pPr>
+        <w:ind w:left="1211" w:hanging="360"/>
+      </w:pPr>
+      <w:rPr>
+        <w:rFonts w:hint="default"/>
+      </w:rPr>
+    </w:lvl>
+    <w:lvl w:ilvl="1" w:tplc="04190019" w:tentative="1">
+      <w:start w:val="1"/>
+      <w:numFmt w:val="lowerLetter"/>
+      <w:lvlText w:val="%2."/>
+      <w:lvlJc w:val="left"/>
+      <w:pPr>
+        <w:ind w:left="1931" w:hanging="360"/>
+      </w:pPr>
+    </w:lvl>
+    <w:lvl w:ilvl="2" w:tplc="0419001B" w:tentative="1">
+      <w:start w:val="1"/>
+      <w:numFmt w:val="lowerRoman"/>
+      <w:lvlText w:val="%3."/>
+      <w:lvlJc w:val="right"/>
+      <w:pPr>
+        <w:ind w:left="2651" w:hanging="180"/>
+      </w:pPr>
+    </w:lvl>
+    <w:lvl w:ilvl="3" w:tplc="0419000F" w:tentative="1">
+      <w:start w:val="1"/>
+      <w:numFmt w:val="decimal"/>
+      <w:lvlText w:val="%4."/>
+      <w:lvlJc w:val="left"/>
+      <w:pPr>
+        <w:ind w:left="3371" w:hanging="360"/>
+      </w:pPr>
+    </w:lvl>
+    <w:lvl w:ilvl="4" w:tplc="04190019" w:tentative="1">
+      <w:start w:val="1"/>
+      <w:numFmt w:val="lowerLetter"/>
+      <w:lvlText w:val="%5."/>
+      <w:lvlJc w:val="left"/>
+      <w:pPr>
+        <w:ind w:left="4091" w:hanging="360"/>
+      </w:pPr>
+    </w:lvl>
+    <w:lvl w:ilvl="5" w:tplc="0419001B" w:tentative="1">
+      <w:start w:val="1"/>
+      <w:numFmt w:val="lowerRoman"/>
+      <w:lvlText w:val="%6."/>
+      <w:lvlJc w:val="right"/>
+      <w:pPr>
+        <w:ind w:left="4811" w:hanging="180"/>
+      </w:pPr>
+    </w:lvl>
+    <w:lvl w:ilvl="6" w:tplc="0419000F" w:tentative="1">
+      <w:start w:val="1"/>
+      <w:numFmt w:val="decimal"/>
+      <w:lvlText w:val="%7."/>
+      <w:lvlJc w:val="left"/>
+      <w:pPr>
+        <w:ind w:left="5531" w:hanging="360"/>
+      </w:pPr>
+    </w:lvl>
+    <w:lvl w:ilvl="7" w:tplc="04190019" w:tentative="1">
+      <w:start w:val="1"/>
+      <w:numFmt w:val="lowerLetter"/>
+      <w:lvlText w:val="%8."/>
+      <w:lvlJc w:val="left"/>
+      <w:pPr>
+        <w:ind w:left="6251" w:hanging="360"/>
+      </w:pPr>
+    </w:lvl>
+    <w:lvl w:ilvl="8" w:tplc="0419001B" w:tentative="1">
+      <w:start w:val="1"/>
+      <w:numFmt w:val="lowerRoman"/>
+      <w:lvlText w:val="%9."/>
+      <w:lvlJc w:val="right"/>
+      <w:pPr>
+        <w:ind w:left="6971" w:hanging="180"/>
+      </w:pPr>
+    </w:lvl>
+  </w:abstractNum>
+  <w:abstractNum w:abstractNumId="4" w15:restartNumberingAfterBreak="0">
+    <w:nsid w:val="2E314950"/>
+    <w:multiLevelType w:val="hybridMultilevel"/>
+    <w:tmpl w:val="76BEC9DE"/>
+    <w:lvl w:ilvl="0" w:tplc="0419000F">
+      <w:start w:val="1"/>
+      <w:numFmt w:val="decimal"/>
+      <w:lvlText w:val="%1."/>
+      <w:lvlJc w:val="left"/>
+      <w:pPr>
+        <w:ind w:left="720" w:hanging="360"/>
+      </w:pPr>
+      <w:rPr>
+        <w:rFonts w:hint="default"/>
+      </w:rPr>
+    </w:lvl>
+    <w:lvl w:ilvl="1" w:tplc="04190019" w:tentative="1">
+      <w:start w:val="1"/>
+      <w:numFmt w:val="lowerLetter"/>
+      <w:lvlText w:val="%2."/>
+      <w:lvlJc w:val="left"/>
+      <w:pPr>
+        <w:ind w:left="1440" w:hanging="360"/>
+      </w:pPr>
+    </w:lvl>
+    <w:lvl w:ilvl="2" w:tplc="0419001B" w:tentative="1">
+      <w:start w:val="1"/>
+      <w:numFmt w:val="lowerRoman"/>
+      <w:lvlText w:val="%3."/>
+      <w:lvlJc w:val="right"/>
+      <w:pPr>
+        <w:ind w:left="2160" w:hanging="180"/>
+      </w:pPr>
+    </w:lvl>
+    <w:lvl w:ilvl="3" w:tplc="0419000F" w:tentative="1">
+      <w:start w:val="1"/>
+      <w:numFmt w:val="decimal"/>
+      <w:lvlText w:val="%4."/>
+      <w:lvlJc w:val="left"/>
+      <w:pPr>
+        <w:ind w:left="2880" w:hanging="360"/>
+      </w:pPr>
+    </w:lvl>
+    <w:lvl w:ilvl="4" w:tplc="04190019" w:tentative="1">
+      <w:start w:val="1"/>
+      <w:numFmt w:val="lowerLetter"/>
+      <w:lvlText w:val="%5."/>
+      <w:lvlJc w:val="left"/>
+      <w:pPr>
+        <w:ind w:left="3600" w:hanging="360"/>
+      </w:pPr>
+    </w:lvl>
+    <w:lvl w:ilvl="5" w:tplc="0419001B" w:tentative="1">
+      <w:start w:val="1"/>
+      <w:numFmt w:val="lowerRoman"/>
+      <w:lvlText w:val="%6."/>
+      <w:lvlJc w:val="right"/>
+      <w:pPr>
+        <w:ind w:left="4320" w:hanging="180"/>
+      </w:pPr>
+    </w:lvl>
+    <w:lvl w:ilvl="6" w:tplc="0419000F" w:tentative="1">
+      <w:start w:val="1"/>
+      <w:numFmt w:val="decimal"/>
+      <w:lvlText w:val="%7."/>
+      <w:lvlJc w:val="left"/>
+      <w:pPr>
+        <w:ind w:left="5040" w:hanging="360"/>
+      </w:pPr>
+    </w:lvl>
+    <w:lvl w:ilvl="7" w:tplc="04190019" w:tentative="1">
+      <w:start w:val="1"/>
+      <w:numFmt w:val="lowerLetter"/>
+      <w:lvlText w:val="%8."/>
+      <w:lvlJc w:val="left"/>
+      <w:pPr>
+        <w:ind w:left="5760" w:hanging="360"/>
+      </w:pPr>
+    </w:lvl>
+    <w:lvl w:ilvl="8" w:tplc="0419001B" w:tentative="1">
+      <w:start w:val="1"/>
+      <w:numFmt w:val="lowerRoman"/>
+      <w:lvlText w:val="%9."/>
+      <w:lvlJc w:val="right"/>
+      <w:pPr>
+        <w:ind w:left="6480" w:hanging="180"/>
+      </w:pPr>
+    </w:lvl>
+  </w:abstractNum>
+  <w:abstractNum w:abstractNumId="5" w15:restartNumberingAfterBreak="0">
+    <w:nsid w:val="55F43C2C"/>
+    <w:multiLevelType w:val="hybridMultilevel"/>
+    <w:tmpl w:val="517672B6"/>
+    <w:lvl w:ilvl="0" w:tplc="D7BCCED4">
+      <w:start w:val="1"/>
+      <w:numFmt w:val="decimal"/>
+      <w:lvlText w:val="%1."/>
+      <w:lvlJc w:val="left"/>
+      <w:pPr>
+        <w:ind w:left="1069" w:hanging="360"/>
+      </w:pPr>
+      <w:rPr>
+        <w:rFonts w:hint="default"/>
+      </w:rPr>
+    </w:lvl>
+    <w:lvl w:ilvl="1" w:tplc="04190019" w:tentative="1">
+      <w:start w:val="1"/>
+      <w:numFmt w:val="lowerLetter"/>
+      <w:lvlText w:val="%2."/>
+      <w:lvlJc w:val="left"/>
+      <w:pPr>
+        <w:ind w:left="1789" w:hanging="360"/>
+      </w:pPr>
+    </w:lvl>
+    <w:lvl w:ilvl="2" w:tplc="0419001B" w:tentative="1">
+      <w:start w:val="1"/>
+      <w:numFmt w:val="lowerRoman"/>
+      <w:lvlText w:val="%3."/>
+      <w:lvlJc w:val="right"/>
+      <w:pPr>
+        <w:ind w:left="2509" w:hanging="180"/>
+      </w:pPr>
+    </w:lvl>
+    <w:lvl w:ilvl="3" w:tplc="0419000F" w:tentative="1">
+      <w:start w:val="1"/>
+      <w:numFmt w:val="decimal"/>
+      <w:lvlText w:val="%4."/>
+      <w:lvlJc w:val="left"/>
+      <w:pPr>
+        <w:ind w:left="3229" w:hanging="360"/>
+      </w:pPr>
+    </w:lvl>
+    <w:lvl w:ilvl="4" w:tplc="04190019" w:tentative="1">
+      <w:start w:val="1"/>
+      <w:numFmt w:val="lowerLetter"/>
+      <w:lvlText w:val="%5."/>
+      <w:lvlJc w:val="left"/>
+      <w:pPr>
+        <w:ind w:left="3949" w:hanging="360"/>
+      </w:pPr>
+    </w:lvl>
+    <w:lvl w:ilvl="5" w:tplc="0419001B" w:tentative="1">
+      <w:start w:val="1"/>
+      <w:numFmt w:val="lowerRoman"/>
+      <w:lvlText w:val="%6."/>
+      <w:lvlJc w:val="right"/>
+      <w:pPr>
+        <w:ind w:left="4669" w:hanging="180"/>
+      </w:pPr>
+    </w:lvl>
+    <w:lvl w:ilvl="6" w:tplc="0419000F" w:tentative="1">
+      <w:start w:val="1"/>
+      <w:numFmt w:val="decimal"/>
+      <w:lvlText w:val="%7."/>
+      <w:lvlJc w:val="left"/>
+      <w:pPr>
+        <w:ind w:left="5389" w:hanging="360"/>
+      </w:pPr>
+    </w:lvl>
+    <w:lvl w:ilvl="7" w:tplc="04190019" w:tentative="1">
+      <w:start w:val="1"/>
+      <w:numFmt w:val="lowerLetter"/>
+      <w:lvlText w:val="%8."/>
+      <w:lvlJc w:val="left"/>
+      <w:pPr>
+        <w:ind w:left="6109" w:hanging="360"/>
+      </w:pPr>
+    </w:lvl>
+    <w:lvl w:ilvl="8" w:tplc="0419001B" w:tentative="1">
+      <w:start w:val="1"/>
+      <w:numFmt w:val="lowerRoman"/>
+      <w:lvlText w:val="%9."/>
+      <w:lvlJc w:val="right"/>
+      <w:pPr>
+        <w:ind w:left="6829" w:hanging="180"/>
+      </w:pPr>
+    </w:lvl>
+  </w:abstractNum>
+  <w:abstractNum w:abstractNumId="6" w15:restartNumberingAfterBreak="0">
+    <w:nsid w:val="564429E2"/>
+    <w:multiLevelType w:val="hybridMultilevel"/>
+    <w:tmpl w:val="CE087F58"/>
+    <w:lvl w:ilvl="0" w:tplc="0419000F">
+      <w:start w:val="1"/>
+      <w:numFmt w:val="decimal"/>
+      <w:lvlText w:val="%1."/>
+      <w:lvlJc w:val="left"/>
+      <w:pPr>
+        <w:ind w:left="720" w:hanging="360"/>
+      </w:pPr>
+      <w:rPr>
+        <w:rFonts w:hint="default"/>
+      </w:rPr>
+    </w:lvl>
+    <w:lvl w:ilvl="1" w:tplc="04190019" w:tentative="1">
+      <w:start w:val="1"/>
+      <w:numFmt w:val="lowerLetter"/>
+      <w:lvlText w:val="%2."/>
+      <w:lvlJc w:val="left"/>
+      <w:pPr>
+        <w:ind w:left="1440" w:hanging="360"/>
+      </w:pPr>
+    </w:lvl>
+    <w:lvl w:ilvl="2" w:tplc="0419001B" w:tentative="1">
+      <w:start w:val="1"/>
+      <w:numFmt w:val="lowerRoman"/>
+      <w:lvlText w:val="%3."/>
+      <w:lvlJc w:val="right"/>
+      <w:pPr>
+        <w:ind w:left="2160" w:hanging="180"/>
+      </w:pPr>
+    </w:lvl>
+    <w:lvl w:ilvl="3" w:tplc="0419000F" w:tentative="1">
+      <w:start w:val="1"/>
+      <w:numFmt w:val="decimal"/>
+      <w:lvlText w:val="%4."/>
+      <w:lvlJc w:val="left"/>
+      <w:pPr>
+        <w:ind w:left="2880" w:hanging="360"/>
+      </w:pPr>
+    </w:lvl>
+    <w:lvl w:ilvl="4" w:tplc="04190019" w:tentative="1">
+      <w:start w:val="1"/>
+      <w:numFmt w:val="lowerLetter"/>
+      <w:lvlText w:val="%5."/>
+      <w:lvlJc w:val="left"/>
+      <w:pPr>
+        <w:ind w:left="3600" w:hanging="360"/>
+      </w:pPr>
+    </w:lvl>
+    <w:lvl w:ilvl="5" w:tplc="0419001B" w:tentative="1">
+      <w:start w:val="1"/>
+      <w:numFmt w:val="lowerRoman"/>
+      <w:lvlText w:val="%6."/>
+      <w:lvlJc w:val="right"/>
+      <w:pPr>
+        <w:ind w:left="4320" w:hanging="180"/>
+      </w:pPr>
+    </w:lvl>
+    <w:lvl w:ilvl="6" w:tplc="0419000F" w:tentative="1">
+      <w:start w:val="1"/>
+      <w:numFmt w:val="decimal"/>
+      <w:lvlText w:val="%7."/>
+      <w:lvlJc w:val="left"/>
+      <w:pPr>
+        <w:ind w:left="5040" w:hanging="360"/>
+      </w:pPr>
+    </w:lvl>
+    <w:lvl w:ilvl="7" w:tplc="04190019" w:tentative="1">
+      <w:start w:val="1"/>
+      <w:numFmt w:val="lowerLetter"/>
+      <w:lvlText w:val="%8."/>
+      <w:lvlJc w:val="left"/>
+      <w:pPr>
+        <w:ind w:left="5760" w:hanging="360"/>
+      </w:pPr>
+    </w:lvl>
+    <w:lvl w:ilvl="8" w:tplc="0419001B" w:tentative="1">
+      <w:start w:val="1"/>
+      <w:numFmt w:val="lowerRoman"/>
+      <w:lvlText w:val="%9."/>
+      <w:lvlJc w:val="right"/>
+      <w:pPr>
+        <w:ind w:left="6480" w:hanging="180"/>
+      </w:pPr>
+    </w:lvl>
+  </w:abstractNum>
+  <w:abstractNum w:abstractNumId="7" w15:restartNumberingAfterBreak="0">
+    <w:nsid w:val="5F465DFE"/>
+    <w:multiLevelType w:val="hybridMultilevel"/>
+    <w:tmpl w:val="6D9EBB94"/>
+    <w:lvl w:ilvl="0" w:tplc="0419000F">
+      <w:start w:val="1"/>
+      <w:numFmt w:val="decimal"/>
+      <w:lvlText w:val="%1."/>
+      <w:lvlJc w:val="left"/>
+      <w:pPr>
+        <w:ind w:left="720" w:hanging="360"/>
+      </w:pPr>
+      <w:rPr>
+        <w:rFonts w:hint="default"/>
+      </w:rPr>
+    </w:lvl>
+    <w:lvl w:ilvl="1" w:tplc="04190019" w:tentative="1">
+      <w:start w:val="1"/>
+      <w:numFmt w:val="lowerLetter"/>
+      <w:lvlText w:val="%2."/>
+      <w:lvlJc w:val="left"/>
+      <w:pPr>
+        <w:ind w:left="1440" w:hanging="360"/>
+      </w:pPr>
+    </w:lvl>
+    <w:lvl w:ilvl="2" w:tplc="0419001B" w:tentative="1">
+      <w:start w:val="1"/>
+      <w:numFmt w:val="lowerRoman"/>
+      <w:lvlText w:val="%3."/>
+      <w:lvlJc w:val="right"/>
+      <w:pPr>
+        <w:ind w:left="2160" w:hanging="180"/>
+      </w:pPr>
+    </w:lvl>
+    <w:lvl w:ilvl="3" w:tplc="0419000F" w:tentative="1">
+      <w:start w:val="1"/>
+      <w:numFmt w:val="decimal"/>
+      <w:lvlText w:val="%4."/>
+      <w:lvlJc w:val="left"/>
+      <w:pPr>
+        <w:ind w:left="2880" w:hanging="360"/>
+      </w:pPr>
+    </w:lvl>
+    <w:lvl w:ilvl="4" w:tplc="04190019" w:tentative="1">
+      <w:start w:val="1"/>
+      <w:numFmt w:val="lowerLetter"/>
+      <w:lvlText w:val="%5."/>
+      <w:lvlJc w:val="left"/>
+      <w:pPr>
+        <w:ind w:left="3600" w:hanging="360"/>
+      </w:pPr>
+    </w:lvl>
+    <w:lvl w:ilvl="5" w:tplc="0419001B" w:tentative="1">
+      <w:start w:val="1"/>
+      <w:numFmt w:val="lowerRoman"/>
+      <w:lvlText w:val="%6."/>
+      <w:lvlJc w:val="right"/>
+      <w:pPr>
+        <w:ind w:left="4320" w:hanging="180"/>
+      </w:pPr>
+    </w:lvl>
+    <w:lvl w:ilvl="6" w:tplc="0419000F" w:tentative="1">
+      <w:start w:val="1"/>
+      <w:numFmt w:val="decimal"/>
+      <w:lvlText w:val="%7."/>
+      <w:lvlJc w:val="left"/>
+      <w:pPr>
+        <w:ind w:left="5040" w:hanging="360"/>
+      </w:pPr>
+    </w:lvl>
+    <w:lvl w:ilvl="7" w:tplc="04190019" w:tentative="1">
+      <w:start w:val="1"/>
+      <w:numFmt w:val="lowerLetter"/>
+      <w:lvlText w:val="%8."/>
+      <w:lvlJc w:val="left"/>
+      <w:pPr>
+        <w:ind w:left="5760" w:hanging="360"/>
+      </w:pPr>
+    </w:lvl>
+    <w:lvl w:ilvl="8" w:tplc="0419001B" w:tentative="1">
+      <w:start w:val="1"/>
+      <w:numFmt w:val="lowerRoman"/>
+      <w:lvlText w:val="%9."/>
+      <w:lvlJc w:val="right"/>
+      <w:pPr>
+        <w:ind w:left="6480" w:hanging="180"/>
       </w:pPr>
     </w:lvl>
   </w:abstractNum>
@@ -2655,7 +4447,25 @@
     <w:abstractNumId w:val="0"/>
   </w:num>
   <w:num w:numId="2" w16cid:durableId="1782723612">
+    <w:abstractNumId w:val="2"/>
+  </w:num>
+  <w:num w:numId="3" w16cid:durableId="86272686">
     <w:abstractNumId w:val="1"/>
+  </w:num>
+  <w:num w:numId="4" w16cid:durableId="231277659">
+    <w:abstractNumId w:val="4"/>
+  </w:num>
+  <w:num w:numId="5" w16cid:durableId="1891450912">
+    <w:abstractNumId w:val="3"/>
+  </w:num>
+  <w:num w:numId="6" w16cid:durableId="1936554720">
+    <w:abstractNumId w:val="7"/>
+  </w:num>
+  <w:num w:numId="7" w16cid:durableId="2097045979">
+    <w:abstractNumId w:val="6"/>
+  </w:num>
+  <w:num w:numId="8" w16cid:durableId="252473957">
+    <w:abstractNumId w:val="5"/>
   </w:num>
 </w:numbering>
 </file>
@@ -3058,7 +4868,7 @@
   <w:style w:type="paragraph" w:default="1" w:styleId="a">
     <w:name w:val="Normal"/>
     <w:qFormat/>
-    <w:rsid w:val="004B6397"/>
+    <w:rsid w:val="00E616CA"/>
     <w:pPr>
       <w:widowControl w:val="0"/>
     </w:pPr>
@@ -3093,6 +4903,7 @@
   <w:style w:type="character" w:default="1" w:styleId="a0">
     <w:name w:val="Default Paragraph Font"/>
     <w:uiPriority w:val="1"/>
+    <w:semiHidden/>
     <w:unhideWhenUsed/>
   </w:style>
   <w:style w:type="table" w:default="1" w:styleId="a1">
@@ -3410,6 +5221,29 @@
       </w:tblBorders>
     </w:tblPr>
   </w:style>
+  <w:style w:type="character" w:styleId="af5">
+    <w:name w:val="Hyperlink"/>
+    <w:basedOn w:val="a0"/>
+    <w:uiPriority w:val="99"/>
+    <w:unhideWhenUsed/>
+    <w:rsid w:val="00231ED9"/>
+    <w:rPr>
+      <w:color w:val="0563C1" w:themeColor="hyperlink"/>
+      <w:u w:val="single"/>
+    </w:rPr>
+  </w:style>
+  <w:style w:type="character" w:styleId="af6">
+    <w:name w:val="Unresolved Mention"/>
+    <w:basedOn w:val="a0"/>
+    <w:uiPriority w:val="99"/>
+    <w:semiHidden/>
+    <w:unhideWhenUsed/>
+    <w:rsid w:val="00231ED9"/>
+    <w:rPr>
+      <w:color w:val="605E5C"/>
+      <w:shd w:val="clear" w:color="auto" w:fill="E1DFDD"/>
+    </w:rPr>
+  </w:style>
 </w:styles>
 </file>
 

</xml_diff>

<commit_message>
Done first practice i swear
</commit_message>
<xml_diff>
--- a/Economics/ПРИ123-ЭКОНОМИКА-#01-Нямаа.docx
+++ b/Economics/ПРИ123-ЭКОНОМИКА-#01-Нямаа.docx
@@ -574,29 +574,21 @@
     </w:p>
     <w:p>
       <w:pPr>
-        <w:pStyle w:val="a4"/>
-        <w:rPr>
-          <w:rFonts w:ascii="Times New Roman" w:hAnsi="Times New Roman"/>
-          <w:sz w:val="28"/>
-          <w:szCs w:val="28"/>
-        </w:rPr>
-      </w:pPr>
-    </w:p>
-    <w:p>
-      <w:pPr>
         <w:jc w:val="center"/>
         <w:rPr>
           <w:sz w:val="44"/>
           <w:szCs w:val="44"/>
         </w:rPr>
       </w:pPr>
-      <w:r>
+    </w:p>
+    <w:p>
+      <w:pPr>
+        <w:jc w:val="center"/>
         <w:rPr>
           <w:sz w:val="44"/>
           <w:szCs w:val="44"/>
         </w:rPr>
-        <w:t>Практическая работа №1</w:t>
-      </w:r>
+      </w:pPr>
     </w:p>
     <w:p>
       <w:pPr>
@@ -611,54 +603,157 @@
           <w:sz w:val="44"/>
           <w:szCs w:val="44"/>
         </w:rPr>
-        <w:t>по дисциплине «Экономика»</w:t>
-      </w:r>
-    </w:p>
-    <w:p>
-      <w:pPr>
-        <w:rPr>
-          <w:sz w:val="44"/>
-          <w:szCs w:val="28"/>
-        </w:rPr>
-      </w:pPr>
-    </w:p>
-    <w:p>
-      <w:pPr>
-        <w:rPr>
-          <w:sz w:val="28"/>
-          <w:szCs w:val="28"/>
-        </w:rPr>
-      </w:pPr>
+        <w:t>«ЭКОНОМИКА»</w:t>
+      </w:r>
     </w:p>
     <w:p>
       <w:pPr>
         <w:jc w:val="center"/>
-        <w:rPr>
-          <w:sz w:val="36"/>
-          <w:szCs w:val="28"/>
-        </w:rPr>
-      </w:pPr>
-      <w:r>
-        <w:rPr>
-          <w:sz w:val="44"/>
-          <w:szCs w:val="28"/>
-        </w:rPr>
-        <w:t>Тема: «</w:t>
-      </w:r>
-      <w:r>
         <w:rPr>
           <w:sz w:val="44"/>
           <w:szCs w:val="44"/>
         </w:rPr>
-        <w:t>История возникновения, предмет и методы экономической науки</w:t>
-      </w:r>
-      <w:r>
+      </w:pPr>
+    </w:p>
+    <w:p>
+      <w:pPr>
+        <w:jc w:val="center"/>
         <w:rPr>
           <w:sz w:val="44"/>
-          <w:szCs w:val="28"/>
-        </w:rPr>
-        <w:t>»</w:t>
-      </w:r>
+          <w:szCs w:val="44"/>
+        </w:rPr>
+      </w:pPr>
+      <w:r>
+        <w:rPr>
+          <w:sz w:val="44"/>
+          <w:szCs w:val="44"/>
+        </w:rPr>
+        <w:t>ОТЧЕТ</w:t>
+      </w:r>
+    </w:p>
+    <w:p>
+      <w:pPr>
+        <w:jc w:val="center"/>
+        <w:rPr>
+          <w:sz w:val="44"/>
+          <w:szCs w:val="44"/>
+        </w:rPr>
+      </w:pPr>
+      <w:r>
+        <w:rPr>
+          <w:sz w:val="44"/>
+          <w:szCs w:val="44"/>
+        </w:rPr>
+        <w:t>по практической работе № 1</w:t>
+      </w:r>
+    </w:p>
+    <w:p>
+      <w:pPr>
+        <w:jc w:val="center"/>
+        <w:rPr>
+          <w:sz w:val="44"/>
+          <w:szCs w:val="44"/>
+        </w:rPr>
+      </w:pPr>
+      <w:r>
+        <w:rPr>
+          <w:sz w:val="44"/>
+          <w:szCs w:val="44"/>
+        </w:rPr>
+        <w:t>«История возникновения, предмет и методы экономической науки»</w:t>
+      </w:r>
+    </w:p>
+    <w:p>
+      <w:pPr>
+        <w:rPr>
+          <w:sz w:val="28"/>
+          <w:szCs w:val="28"/>
+        </w:rPr>
+      </w:pPr>
+    </w:p>
+    <w:p>
+      <w:pPr>
+        <w:rPr>
+          <w:sz w:val="28"/>
+          <w:szCs w:val="28"/>
+        </w:rPr>
+      </w:pPr>
+    </w:p>
+    <w:p>
+      <w:pPr>
+        <w:rPr>
+          <w:sz w:val="28"/>
+          <w:szCs w:val="28"/>
+        </w:rPr>
+      </w:pPr>
+    </w:p>
+    <w:p>
+      <w:pPr>
+        <w:rPr>
+          <w:sz w:val="28"/>
+          <w:szCs w:val="28"/>
+        </w:rPr>
+      </w:pPr>
+    </w:p>
+    <w:p>
+      <w:pPr>
+        <w:ind w:left="6663" w:hanging="284"/>
+        <w:rPr>
+          <w:sz w:val="28"/>
+          <w:szCs w:val="28"/>
+        </w:rPr>
+      </w:pPr>
+      <w:r>
+        <w:rPr>
+          <w:sz w:val="28"/>
+          <w:szCs w:val="28"/>
+        </w:rPr>
+        <w:t>Выполнил:</w:t>
+      </w:r>
+    </w:p>
+    <w:p>
+      <w:pPr>
+        <w:ind w:left="6663" w:hanging="284"/>
+        <w:rPr>
+          <w:sz w:val="28"/>
+          <w:szCs w:val="28"/>
+        </w:rPr>
+      </w:pPr>
+      <w:r>
+        <w:rPr>
+          <w:sz w:val="28"/>
+          <w:szCs w:val="28"/>
+        </w:rPr>
+        <w:t>студент гр. ПРИ-123</w:t>
+      </w:r>
+    </w:p>
+    <w:p>
+      <w:pPr>
+        <w:ind w:left="6663" w:hanging="284"/>
+        <w:rPr>
+          <w:color w:val="000000" w:themeColor="text1"/>
+          <w:sz w:val="28"/>
+          <w:szCs w:val="28"/>
+        </w:rPr>
+      </w:pPr>
+      <w:r>
+        <w:rPr>
+          <w:color w:val="000000" w:themeColor="text1"/>
+          <w:sz w:val="28"/>
+          <w:szCs w:val="28"/>
+        </w:rPr>
+        <w:t xml:space="preserve">А.Ц. </w:t>
+      </w:r>
+      <w:proofErr w:type="spellStart"/>
+      <w:r>
+        <w:rPr>
+          <w:color w:val="000000" w:themeColor="text1"/>
+          <w:sz w:val="28"/>
+          <w:szCs w:val="28"/>
+        </w:rPr>
+        <w:t>Нямаа</w:t>
+      </w:r>
+      <w:proofErr w:type="spellEnd"/>
     </w:p>
     <w:p>
       <w:pPr>
@@ -671,47 +766,6 @@
     </w:p>
     <w:p>
       <w:pPr>
-        <w:jc w:val="right"/>
-        <w:rPr>
-          <w:sz w:val="28"/>
-          <w:szCs w:val="28"/>
-        </w:rPr>
-      </w:pPr>
-    </w:p>
-    <w:p>
-      <w:pPr>
-        <w:rPr>
-          <w:sz w:val="28"/>
-          <w:szCs w:val="28"/>
-        </w:rPr>
-      </w:pPr>
-    </w:p>
-    <w:p>
-      <w:pPr>
-        <w:rPr>
-          <w:sz w:val="28"/>
-          <w:szCs w:val="28"/>
-        </w:rPr>
-      </w:pPr>
-    </w:p>
-    <w:p>
-      <w:pPr>
-        <w:rPr>
-          <w:sz w:val="28"/>
-          <w:szCs w:val="28"/>
-        </w:rPr>
-      </w:pPr>
-    </w:p>
-    <w:p>
-      <w:pPr>
-        <w:rPr>
-          <w:sz w:val="28"/>
-          <w:szCs w:val="28"/>
-        </w:rPr>
-      </w:pPr>
-    </w:p>
-    <w:p>
-      <w:pPr>
         <w:ind w:left="6663" w:hanging="284"/>
         <w:rPr>
           <w:sz w:val="28"/>
@@ -723,7 +777,7 @@
           <w:sz w:val="28"/>
           <w:szCs w:val="28"/>
         </w:rPr>
-        <w:t>Выполнил:</w:t>
+        <w:t>Приняла:</w:t>
       </w:r>
     </w:p>
     <w:p>
@@ -739,7 +793,7 @@
           <w:sz w:val="28"/>
           <w:szCs w:val="28"/>
         </w:rPr>
-        <w:t>студент гр. ПРИ-123</w:t>
+        <w:t>Ассистент</w:t>
       </w:r>
     </w:p>
     <w:p>
@@ -753,100 +807,11 @@
       </w:pPr>
       <w:r>
         <w:rPr>
-          <w:color w:val="000000" w:themeColor="text1"/>
-          <w:sz w:val="28"/>
-          <w:szCs w:val="28"/>
-        </w:rPr>
-        <w:t xml:space="preserve">А.Ц. </w:t>
-      </w:r>
-      <w:proofErr w:type="spellStart"/>
-      <w:r>
-        <w:rPr>
-          <w:color w:val="000000" w:themeColor="text1"/>
-          <w:sz w:val="28"/>
-          <w:szCs w:val="28"/>
-        </w:rPr>
-        <w:t>Нямаа</w:t>
-      </w:r>
-      <w:proofErr w:type="spellEnd"/>
-    </w:p>
-    <w:p>
-      <w:pPr>
-        <w:jc w:val="right"/>
-        <w:rPr>
-          <w:sz w:val="28"/>
-          <w:szCs w:val="28"/>
-        </w:rPr>
-      </w:pPr>
-    </w:p>
-    <w:p>
-      <w:pPr>
-        <w:ind w:left="6663" w:hanging="284"/>
-        <w:rPr>
-          <w:sz w:val="28"/>
-          <w:szCs w:val="28"/>
-        </w:rPr>
-      </w:pPr>
-      <w:r>
-        <w:rPr>
-          <w:sz w:val="28"/>
-          <w:szCs w:val="28"/>
-        </w:rPr>
-        <w:t>Приняла:</w:t>
-      </w:r>
-    </w:p>
-    <w:p>
-      <w:pPr>
-        <w:ind w:left="6663" w:hanging="284"/>
-        <w:rPr>
-          <w:sz w:val="28"/>
-          <w:szCs w:val="28"/>
-        </w:rPr>
-      </w:pPr>
-      <w:r>
-        <w:rPr>
-          <w:sz w:val="28"/>
-          <w:szCs w:val="28"/>
-        </w:rPr>
-        <w:t>Ассистент</w:t>
-      </w:r>
-    </w:p>
-    <w:p>
-      <w:pPr>
-        <w:ind w:left="6663" w:hanging="284"/>
-        <w:rPr>
-          <w:color w:val="000000" w:themeColor="text1"/>
-          <w:sz w:val="28"/>
-          <w:szCs w:val="28"/>
-        </w:rPr>
-      </w:pPr>
-      <w:r>
-        <w:rPr>
           <w:sz w:val="28"/>
           <w:szCs w:val="28"/>
         </w:rPr>
         <w:t>Ю.А. Муравьева</w:t>
       </w:r>
-    </w:p>
-    <w:p>
-      <w:pPr>
-        <w:pStyle w:val="a4"/>
-        <w:rPr>
-          <w:rFonts w:ascii="Times New Roman" w:hAnsi="Times New Roman"/>
-          <w:sz w:val="28"/>
-          <w:szCs w:val="28"/>
-        </w:rPr>
-      </w:pPr>
-    </w:p>
-    <w:p>
-      <w:pPr>
-        <w:pStyle w:val="a4"/>
-        <w:rPr>
-          <w:rFonts w:ascii="Times New Roman" w:hAnsi="Times New Roman"/>
-          <w:sz w:val="28"/>
-          <w:szCs w:val="28"/>
-        </w:rPr>
-      </w:pPr>
     </w:p>
     <w:p>
       <w:pPr>
@@ -2376,19 +2341,7 @@
         <w:rPr>
           <w:sz w:val="28"/>
         </w:rPr>
-        <w:t xml:space="preserve">– </w:t>
-      </w:r>
-      <w:r>
-        <w:rPr>
-          <w:sz w:val="28"/>
-        </w:rPr>
-        <w:t>это</w:t>
-      </w:r>
-      <w:r>
-        <w:rPr>
-          <w:sz w:val="28"/>
-        </w:rPr>
-        <w:t xml:space="preserve"> метод, который заключается в</w:t>
+        <w:t>– это метод, который заключается в</w:t>
       </w:r>
       <w:r>
         <w:rPr>
@@ -2412,37 +2365,13 @@
         <w:rPr>
           <w:sz w:val="28"/>
         </w:rPr>
-        <w:t xml:space="preserve"> </w:t>
-      </w:r>
-      <w:r>
-        <w:rPr>
-          <w:sz w:val="28"/>
-        </w:rPr>
-        <w:t>Пример:</w:t>
-      </w:r>
-      <w:r>
-        <w:rPr>
-          <w:sz w:val="28"/>
-        </w:rPr>
-        <w:t xml:space="preserve"> центральный банк следит за уровнем</w:t>
-      </w:r>
-      <w:r>
-        <w:rPr>
-          <w:sz w:val="28"/>
-        </w:rPr>
-        <w:t xml:space="preserve"> </w:t>
-      </w:r>
-      <w:r>
-        <w:rPr>
-          <w:sz w:val="28"/>
-        </w:rPr>
-        <w:t>золотовалютных резервов</w:t>
-      </w:r>
-      <w:r>
-        <w:rPr>
-          <w:sz w:val="28"/>
-        </w:rPr>
-        <w:t>,</w:t>
+        <w:t xml:space="preserve"> Пример: центральный банк следит за уровнем</w:t>
+      </w:r>
+      <w:r>
+        <w:rPr>
+          <w:sz w:val="28"/>
+        </w:rPr>
+        <w:t xml:space="preserve"> золотовалютных резервов,</w:t>
       </w:r>
       <w:r>
         <w:rPr>
@@ -3320,19 +3249,30 @@
     <w:p>
       <w:pPr>
         <w:spacing w:line="360" w:lineRule="auto"/>
-        <w:jc w:val="center"/>
-        <w:rPr>
-          <w:sz w:val="28"/>
-          <w:szCs w:val="28"/>
-        </w:rPr>
-      </w:pPr>
-      <w:r>
-        <w:rPr>
-          <w:sz w:val="28"/>
-          <w:szCs w:val="28"/>
+        <w:ind w:left="7655"/>
+        <w:rPr>
+          <w:sz w:val="24"/>
+          <w:szCs w:val="24"/>
+        </w:rPr>
+      </w:pPr>
+      <w:r>
+        <w:rPr>
+          <w:b/>
+          <w:bCs/>
+          <w:sz w:val="24"/>
+          <w:szCs w:val="24"/>
         </w:rPr>
         <w:lastRenderedPageBreak/>
-        <w:t>ПРИЛОЖЕНИЕ 1:</w:t>
+        <w:t xml:space="preserve">Приложение </w:t>
+      </w:r>
+      <w:r>
+        <w:rPr>
+          <w:b/>
+          <w:bCs/>
+          <w:sz w:val="24"/>
+          <w:szCs w:val="24"/>
+        </w:rPr>
+        <w:t>1</w:t>
       </w:r>
     </w:p>
     <w:p>
@@ -3357,63 +3297,966 @@
     <w:p>
       <w:pPr>
         <w:spacing w:line="360" w:lineRule="auto"/>
-        <w:ind w:firstLine="989"/>
-        <w:jc w:val="both"/>
-        <w:rPr>
-          <w:sz w:val="24"/>
-          <w:szCs w:val="24"/>
-        </w:rPr>
-      </w:pPr>
-      <w:r>
-        <w:rPr>
-          <w:sz w:val="24"/>
-          <w:szCs w:val="24"/>
-        </w:rPr>
-        <w:t>Введение</w:t>
-      </w:r>
-    </w:p>
-    <w:p/>
-    <w:p>
-      <w:pPr>
-        <w:spacing w:line="360" w:lineRule="auto"/>
-        <w:ind w:firstLine="989"/>
-        <w:jc w:val="both"/>
-        <w:rPr>
-          <w:sz w:val="24"/>
-          <w:szCs w:val="24"/>
-        </w:rPr>
-      </w:pPr>
-      <w:r>
-        <w:rPr>
-          <w:sz w:val="24"/>
-          <w:szCs w:val="24"/>
-        </w:rPr>
-        <w:t>Основная часть</w:t>
-      </w:r>
-    </w:p>
-    <w:p>
-      <w:pPr>
-        <w:spacing w:line="360" w:lineRule="auto"/>
-        <w:ind w:firstLine="989"/>
-        <w:jc w:val="both"/>
-        <w:rPr>
-          <w:sz w:val="24"/>
-          <w:szCs w:val="24"/>
-        </w:rPr>
-      </w:pPr>
-      <w:r>
-        <w:rPr>
-          <w:sz w:val="24"/>
-          <w:szCs w:val="24"/>
-        </w:rPr>
-        <w:t>Краткие выводы</w:t>
-      </w:r>
-    </w:p>
-    <w:p>
-      <w:pPr>
-        <w:spacing w:line="360" w:lineRule="auto"/>
-        <w:ind w:firstLine="989"/>
-        <w:jc w:val="both"/>
+        <w:ind w:firstLine="709"/>
+        <w:jc w:val="both"/>
+        <w:rPr>
+          <w:sz w:val="24"/>
+          <w:szCs w:val="24"/>
+        </w:rPr>
+      </w:pPr>
+      <w:r>
+        <w:rPr>
+          <w:sz w:val="24"/>
+          <w:szCs w:val="24"/>
+        </w:rPr>
+        <w:t xml:space="preserve">В настоящее время отечественные производители являются важнейшими участниками экономического развития любой страны. </w:t>
+      </w:r>
+      <w:r>
+        <w:rPr>
+          <w:sz w:val="24"/>
+          <w:szCs w:val="24"/>
+        </w:rPr>
+        <w:t>Но в сложных экономических условиях и при высокой конкуренции с импортными компаниями</w:t>
+      </w:r>
+      <w:r>
+        <w:rPr>
+          <w:sz w:val="24"/>
+          <w:szCs w:val="24"/>
+        </w:rPr>
+        <w:t>, технологии которых в разы лучше тех, что существуют у местных компаний, а продукция сильно дешевле за счёт недорогой рабочей силы,</w:t>
+      </w:r>
+      <w:r>
+        <w:rPr>
+          <w:sz w:val="24"/>
+          <w:szCs w:val="24"/>
+        </w:rPr>
+        <w:t xml:space="preserve"> их </w:t>
+      </w:r>
+      <w:r>
+        <w:rPr>
+          <w:sz w:val="24"/>
+          <w:szCs w:val="24"/>
+        </w:rPr>
+        <w:t>существование и развитие</w:t>
+      </w:r>
+      <w:r>
+        <w:rPr>
+          <w:sz w:val="24"/>
+          <w:szCs w:val="24"/>
+        </w:rPr>
+        <w:t xml:space="preserve"> становится очень затруднено, а иногда и вовсе</w:t>
+      </w:r>
+      <w:r>
+        <w:rPr>
+          <w:sz w:val="24"/>
+          <w:szCs w:val="24"/>
+        </w:rPr>
+        <w:t xml:space="preserve"> невозможно</w:t>
+      </w:r>
+      <w:r>
+        <w:rPr>
+          <w:sz w:val="24"/>
+          <w:szCs w:val="24"/>
+        </w:rPr>
+        <w:t>, что приводит к вопросу о необходимости поддерживать отечественных производителей.</w:t>
+      </w:r>
+      <w:r>
+        <w:rPr>
+          <w:sz w:val="24"/>
+          <w:szCs w:val="24"/>
+        </w:rPr>
+        <w:t xml:space="preserve"> Чтобы дать наиболее достоверный ответ на данный вопрос, необходимо разобраться более глубоко и узнать все положительные и отрицательные стороны от подобной помощи.</w:t>
+      </w:r>
+    </w:p>
+    <w:p>
+      <w:pPr>
+        <w:spacing w:line="360" w:lineRule="auto"/>
+        <w:ind w:firstLine="709"/>
+        <w:jc w:val="both"/>
+        <w:rPr>
+          <w:sz w:val="24"/>
+          <w:szCs w:val="24"/>
+        </w:rPr>
+      </w:pPr>
+      <w:r>
+        <w:rPr>
+          <w:sz w:val="24"/>
+          <w:szCs w:val="24"/>
+        </w:rPr>
+        <w:t>Поддержка местных производителей зачастую рассматривается как один из важнейших вопросов, поскольку именно отечественные компании могут принести огромный вклад в экономику государства</w:t>
+      </w:r>
+      <w:r>
+        <w:rPr>
+          <w:sz w:val="24"/>
+          <w:szCs w:val="24"/>
+        </w:rPr>
+        <w:t xml:space="preserve"> и </w:t>
+      </w:r>
+      <w:r>
+        <w:rPr>
+          <w:sz w:val="24"/>
+          <w:szCs w:val="24"/>
+        </w:rPr>
+        <w:t xml:space="preserve">улучшение </w:t>
+      </w:r>
+      <w:r>
+        <w:rPr>
+          <w:sz w:val="24"/>
+          <w:szCs w:val="24"/>
+        </w:rPr>
+        <w:t xml:space="preserve">благосостояния населения. В первую очередь отечественные производители создают большое количество новых рабочих мест, что </w:t>
+      </w:r>
+      <w:r>
+        <w:rPr>
+          <w:sz w:val="24"/>
+          <w:szCs w:val="24"/>
+        </w:rPr>
+        <w:t xml:space="preserve">обеспечивает бóльшую занятость населения и </w:t>
+      </w:r>
+      <w:r>
+        <w:rPr>
+          <w:sz w:val="24"/>
+          <w:szCs w:val="24"/>
+        </w:rPr>
+        <w:t>влияет на множество важных экономических факторов</w:t>
+      </w:r>
+      <w:r>
+        <w:rPr>
+          <w:sz w:val="24"/>
+          <w:szCs w:val="24"/>
+        </w:rPr>
+        <w:t xml:space="preserve">. Прямое влияние может отображаться, </w:t>
+      </w:r>
+      <w:r>
+        <w:rPr>
+          <w:sz w:val="24"/>
+          <w:szCs w:val="24"/>
+        </w:rPr>
+        <w:t xml:space="preserve">например, на </w:t>
+      </w:r>
+      <w:r>
+        <w:rPr>
+          <w:sz w:val="24"/>
+          <w:szCs w:val="24"/>
+        </w:rPr>
+        <w:t xml:space="preserve">снижении уровня </w:t>
+      </w:r>
+      <w:r>
+        <w:rPr>
+          <w:sz w:val="24"/>
+          <w:szCs w:val="24"/>
+        </w:rPr>
+        <w:t>безработиц</w:t>
+      </w:r>
+      <w:r>
+        <w:rPr>
+          <w:sz w:val="24"/>
+          <w:szCs w:val="24"/>
+        </w:rPr>
+        <w:t>ы</w:t>
+      </w:r>
+      <w:r>
+        <w:rPr>
+          <w:sz w:val="24"/>
+          <w:szCs w:val="24"/>
+        </w:rPr>
+        <w:t xml:space="preserve">, </w:t>
+      </w:r>
+      <w:r>
+        <w:rPr>
+          <w:sz w:val="24"/>
+          <w:szCs w:val="24"/>
+        </w:rPr>
+        <w:t xml:space="preserve">а </w:t>
+      </w:r>
+      <w:r>
+        <w:rPr>
+          <w:sz w:val="24"/>
+          <w:szCs w:val="24"/>
+        </w:rPr>
+        <w:t>косвенно</w:t>
+      </w:r>
+      <w:r>
+        <w:rPr>
+          <w:sz w:val="24"/>
+          <w:szCs w:val="24"/>
+        </w:rPr>
+        <w:t>е – в увеличении покупательной способности населения</w:t>
+      </w:r>
+      <w:r>
+        <w:rPr>
+          <w:sz w:val="24"/>
+          <w:szCs w:val="24"/>
+        </w:rPr>
+        <w:t xml:space="preserve">. Местные предприятия помогают стабилизировать социальную составляющую, гарантируя постоянный </w:t>
+      </w:r>
+      <w:r>
+        <w:rPr>
+          <w:sz w:val="24"/>
+          <w:szCs w:val="24"/>
+        </w:rPr>
+        <w:t>доход</w:t>
+      </w:r>
+      <w:r>
+        <w:rPr>
+          <w:sz w:val="24"/>
+          <w:szCs w:val="24"/>
+        </w:rPr>
+        <w:t xml:space="preserve"> сотрудникам</w:t>
+      </w:r>
+      <w:r>
+        <w:rPr>
+          <w:sz w:val="24"/>
+          <w:szCs w:val="24"/>
+        </w:rPr>
+        <w:t>, увеличивая средний заработок</w:t>
+      </w:r>
+      <w:r>
+        <w:rPr>
+          <w:sz w:val="24"/>
+          <w:szCs w:val="24"/>
+        </w:rPr>
+        <w:t xml:space="preserve"> и улучшая их качество жизни.</w:t>
+      </w:r>
+    </w:p>
+    <w:p>
+      <w:pPr>
+        <w:spacing w:line="360" w:lineRule="auto"/>
+        <w:ind w:firstLine="709"/>
+        <w:jc w:val="both"/>
+        <w:rPr>
+          <w:sz w:val="24"/>
+          <w:szCs w:val="24"/>
+        </w:rPr>
+      </w:pPr>
+      <w:r>
+        <w:rPr>
+          <w:sz w:val="24"/>
+          <w:szCs w:val="24"/>
+        </w:rPr>
+        <w:t>Также</w:t>
+      </w:r>
+      <w:r>
+        <w:rPr>
+          <w:sz w:val="24"/>
+          <w:szCs w:val="24"/>
+        </w:rPr>
+        <w:t xml:space="preserve"> </w:t>
+      </w:r>
+      <w:r>
+        <w:rPr>
+          <w:sz w:val="24"/>
+          <w:szCs w:val="24"/>
+        </w:rPr>
+        <w:t xml:space="preserve">отечественные компании </w:t>
+      </w:r>
+      <w:r>
+        <w:rPr>
+          <w:sz w:val="24"/>
+          <w:szCs w:val="24"/>
+        </w:rPr>
+        <w:t>формируют</w:t>
+      </w:r>
+      <w:r>
+        <w:rPr>
+          <w:sz w:val="24"/>
+          <w:szCs w:val="24"/>
+        </w:rPr>
+        <w:t xml:space="preserve"> значительную часть налоговых отчислений, которые поступают в бюджет страны</w:t>
+      </w:r>
+      <w:r>
+        <w:rPr>
+          <w:sz w:val="24"/>
+          <w:szCs w:val="24"/>
+        </w:rPr>
+        <w:t xml:space="preserve">. Полученные средства могут </w:t>
+      </w:r>
+      <w:r>
+        <w:rPr>
+          <w:sz w:val="24"/>
+          <w:szCs w:val="24"/>
+        </w:rPr>
+        <w:t>использ</w:t>
+      </w:r>
+      <w:r>
+        <w:rPr>
+          <w:sz w:val="24"/>
+          <w:szCs w:val="24"/>
+        </w:rPr>
+        <w:t xml:space="preserve">оваться </w:t>
+      </w:r>
+      <w:r>
+        <w:rPr>
+          <w:sz w:val="24"/>
+          <w:szCs w:val="24"/>
+        </w:rPr>
+        <w:t>на различные блага населения и</w:t>
+      </w:r>
+      <w:r>
+        <w:rPr>
+          <w:sz w:val="24"/>
+          <w:szCs w:val="24"/>
+        </w:rPr>
+        <w:t xml:space="preserve"> цели страны</w:t>
+      </w:r>
+      <w:r>
+        <w:rPr>
+          <w:sz w:val="24"/>
+          <w:szCs w:val="24"/>
+        </w:rPr>
+        <w:t>: развитие инфраструктуры, социальные программы, образование, медицина и множество других направлений</w:t>
+      </w:r>
+      <w:r>
+        <w:rPr>
+          <w:sz w:val="24"/>
+          <w:szCs w:val="24"/>
+        </w:rPr>
+        <w:t xml:space="preserve">. </w:t>
+      </w:r>
+      <w:r>
+        <w:rPr>
+          <w:sz w:val="24"/>
+          <w:szCs w:val="24"/>
+        </w:rPr>
+        <w:t xml:space="preserve">Государство получает </w:t>
+      </w:r>
+      <w:r>
+        <w:rPr>
+          <w:sz w:val="24"/>
+          <w:szCs w:val="24"/>
+        </w:rPr>
+        <w:t>налоговый процент</w:t>
+      </w:r>
+      <w:r>
+        <w:rPr>
+          <w:sz w:val="24"/>
+          <w:szCs w:val="24"/>
+        </w:rPr>
+        <w:t xml:space="preserve"> с местных производителей с кажд</w:t>
+      </w:r>
+      <w:r>
+        <w:rPr>
+          <w:sz w:val="24"/>
+          <w:szCs w:val="24"/>
+        </w:rPr>
+        <w:t>ого</w:t>
+      </w:r>
+      <w:r>
+        <w:rPr>
+          <w:sz w:val="24"/>
+          <w:szCs w:val="24"/>
+        </w:rPr>
+        <w:t xml:space="preserve"> проданн</w:t>
+      </w:r>
+      <w:r>
+        <w:rPr>
+          <w:sz w:val="24"/>
+          <w:szCs w:val="24"/>
+        </w:rPr>
+        <w:t>ого</w:t>
+      </w:r>
+      <w:r>
+        <w:rPr>
+          <w:sz w:val="24"/>
+          <w:szCs w:val="24"/>
+        </w:rPr>
+        <w:t xml:space="preserve"> товар</w:t>
+      </w:r>
+      <w:r>
+        <w:rPr>
+          <w:sz w:val="24"/>
+          <w:szCs w:val="24"/>
+        </w:rPr>
+        <w:t>а</w:t>
+      </w:r>
+      <w:r>
+        <w:rPr>
+          <w:sz w:val="24"/>
+          <w:szCs w:val="24"/>
+        </w:rPr>
+        <w:t xml:space="preserve"> или сырь</w:t>
+      </w:r>
+      <w:r>
+        <w:rPr>
+          <w:sz w:val="24"/>
+          <w:szCs w:val="24"/>
+        </w:rPr>
+        <w:t>я</w:t>
+      </w:r>
+      <w:r>
+        <w:rPr>
+          <w:sz w:val="24"/>
+          <w:szCs w:val="24"/>
+        </w:rPr>
+        <w:t xml:space="preserve">, с арендованных помещений, с </w:t>
+      </w:r>
+      <w:r>
+        <w:rPr>
+          <w:sz w:val="24"/>
+          <w:szCs w:val="24"/>
+        </w:rPr>
+        <w:t>доход</w:t>
+      </w:r>
+      <w:r>
+        <w:rPr>
+          <w:sz w:val="24"/>
+          <w:szCs w:val="24"/>
+        </w:rPr>
+        <w:t>а</w:t>
+      </w:r>
+      <w:r>
+        <w:rPr>
+          <w:sz w:val="24"/>
+          <w:szCs w:val="24"/>
+        </w:rPr>
+        <w:t xml:space="preserve"> </w:t>
+      </w:r>
+      <w:r>
+        <w:rPr>
+          <w:sz w:val="24"/>
+          <w:szCs w:val="24"/>
+        </w:rPr>
+        <w:t>каждого сотрудника компании</w:t>
+      </w:r>
+      <w:r>
+        <w:rPr>
+          <w:sz w:val="24"/>
+          <w:szCs w:val="24"/>
+        </w:rPr>
+        <w:t xml:space="preserve">, а </w:t>
+      </w:r>
+      <w:r>
+        <w:rPr>
+          <w:sz w:val="24"/>
+          <w:szCs w:val="24"/>
+        </w:rPr>
+        <w:t xml:space="preserve">также с множества других операций, где используется местная валюта или </w:t>
+      </w:r>
+      <w:r>
+        <w:rPr>
+          <w:sz w:val="24"/>
+          <w:szCs w:val="24"/>
+        </w:rPr>
+        <w:t xml:space="preserve">задействовано </w:t>
+      </w:r>
+      <w:r>
+        <w:rPr>
+          <w:sz w:val="24"/>
+          <w:szCs w:val="24"/>
+        </w:rPr>
+        <w:t>налогообложение</w:t>
+      </w:r>
+      <w:r>
+        <w:rPr>
+          <w:sz w:val="24"/>
+          <w:szCs w:val="24"/>
+        </w:rPr>
+        <w:t xml:space="preserve"> страны</w:t>
+      </w:r>
+      <w:r>
+        <w:rPr>
+          <w:sz w:val="24"/>
+          <w:szCs w:val="24"/>
+        </w:rPr>
+        <w:t>.</w:t>
+      </w:r>
+    </w:p>
+    <w:p>
+      <w:pPr>
+        <w:spacing w:line="360" w:lineRule="auto"/>
+        <w:ind w:firstLine="709"/>
+        <w:jc w:val="both"/>
+        <w:rPr>
+          <w:sz w:val="24"/>
+          <w:szCs w:val="24"/>
+        </w:rPr>
+      </w:pPr>
+      <w:r>
+        <w:rPr>
+          <w:sz w:val="24"/>
+          <w:szCs w:val="24"/>
+        </w:rPr>
+        <w:t>Важным фактором, который необходимо учесть при разборе вопроса поддержки отечественных производителей государством, является экономическая независимость страны. Развитие именно местных компаний</w:t>
+      </w:r>
+      <w:r>
+        <w:rPr>
+          <w:sz w:val="24"/>
+          <w:szCs w:val="24"/>
+        </w:rPr>
+        <w:t xml:space="preserve"> </w:t>
+      </w:r>
+      <w:r>
+        <w:rPr>
+          <w:sz w:val="24"/>
+          <w:szCs w:val="24"/>
+        </w:rPr>
+        <w:t xml:space="preserve">снижает зависимость от импортных </w:t>
+      </w:r>
+      <w:r>
+        <w:rPr>
+          <w:sz w:val="24"/>
+          <w:szCs w:val="24"/>
+        </w:rPr>
+        <w:t>товар</w:t>
+      </w:r>
+      <w:r>
+        <w:rPr>
+          <w:sz w:val="24"/>
+          <w:szCs w:val="24"/>
+        </w:rPr>
+        <w:t>ов</w:t>
+      </w:r>
+      <w:r>
+        <w:rPr>
+          <w:sz w:val="24"/>
+          <w:szCs w:val="24"/>
+        </w:rPr>
+        <w:t>, технологи</w:t>
+      </w:r>
+      <w:r>
+        <w:rPr>
+          <w:sz w:val="24"/>
+          <w:szCs w:val="24"/>
+        </w:rPr>
+        <w:t>й</w:t>
+      </w:r>
+      <w:r>
+        <w:rPr>
+          <w:sz w:val="24"/>
+          <w:szCs w:val="24"/>
+        </w:rPr>
+        <w:t xml:space="preserve"> и сырь</w:t>
+      </w:r>
+      <w:r>
+        <w:rPr>
+          <w:sz w:val="24"/>
+          <w:szCs w:val="24"/>
+        </w:rPr>
+        <w:t>я</w:t>
+      </w:r>
+      <w:r>
+        <w:rPr>
+          <w:sz w:val="24"/>
+          <w:szCs w:val="24"/>
+        </w:rPr>
+        <w:t xml:space="preserve"> из иных стран</w:t>
+      </w:r>
+      <w:r>
+        <w:rPr>
+          <w:sz w:val="24"/>
+          <w:szCs w:val="24"/>
+        </w:rPr>
+        <w:t xml:space="preserve">, что особенно важно в некоторых сферах, как медицина, энергетика или </w:t>
+      </w:r>
+      <w:r>
+        <w:rPr>
+          <w:sz w:val="24"/>
+          <w:szCs w:val="24"/>
+          <w:lang w:val="en-US"/>
+        </w:rPr>
+        <w:t>IT</w:t>
+      </w:r>
+      <w:r>
+        <w:rPr>
+          <w:sz w:val="24"/>
+          <w:szCs w:val="24"/>
+        </w:rPr>
+        <w:t>-</w:t>
+      </w:r>
+      <w:r>
+        <w:rPr>
+          <w:sz w:val="24"/>
+          <w:szCs w:val="24"/>
+        </w:rPr>
+        <w:t>технологии.</w:t>
+      </w:r>
+      <w:r>
+        <w:rPr>
+          <w:sz w:val="24"/>
+          <w:szCs w:val="24"/>
+        </w:rPr>
+        <w:t xml:space="preserve"> Также активное развитие отечественных производителей способствует </w:t>
+      </w:r>
+      <w:r>
+        <w:rPr>
+          <w:sz w:val="24"/>
+          <w:szCs w:val="24"/>
+        </w:rPr>
+        <w:t>увелич</w:t>
+      </w:r>
+      <w:r>
+        <w:rPr>
+          <w:sz w:val="24"/>
+          <w:szCs w:val="24"/>
+        </w:rPr>
+        <w:t>ению</w:t>
+      </w:r>
+      <w:r>
+        <w:rPr>
+          <w:sz w:val="24"/>
+          <w:szCs w:val="24"/>
+        </w:rPr>
+        <w:t xml:space="preserve"> объе</w:t>
+      </w:r>
+      <w:r>
+        <w:rPr>
+          <w:sz w:val="24"/>
+          <w:szCs w:val="24"/>
+        </w:rPr>
+        <w:t>ма</w:t>
+      </w:r>
+      <w:r>
+        <w:rPr>
+          <w:sz w:val="24"/>
+          <w:szCs w:val="24"/>
+        </w:rPr>
+        <w:t xml:space="preserve"> экспорта в нуждающиеся государства, </w:t>
+      </w:r>
+      <w:r>
+        <w:rPr>
+          <w:sz w:val="24"/>
+          <w:szCs w:val="24"/>
+        </w:rPr>
+        <w:lastRenderedPageBreak/>
+        <w:t>что укрепляет национальную валюту</w:t>
+      </w:r>
+      <w:r>
+        <w:rPr>
+          <w:sz w:val="24"/>
+          <w:szCs w:val="24"/>
+        </w:rPr>
+        <w:t xml:space="preserve"> и </w:t>
+      </w:r>
+      <w:r>
+        <w:rPr>
+          <w:sz w:val="24"/>
+          <w:szCs w:val="24"/>
+        </w:rPr>
+        <w:t>экономическое положение страны на мировом рынке.</w:t>
+      </w:r>
+    </w:p>
+    <w:p>
+      <w:pPr>
+        <w:spacing w:line="360" w:lineRule="auto"/>
+        <w:ind w:firstLine="709"/>
+        <w:jc w:val="both"/>
+        <w:rPr>
+          <w:sz w:val="24"/>
+          <w:szCs w:val="24"/>
+        </w:rPr>
+      </w:pPr>
+      <w:r>
+        <w:rPr>
+          <w:sz w:val="24"/>
+          <w:szCs w:val="24"/>
+        </w:rPr>
+        <w:t xml:space="preserve">Однако, несмотря на действительно значимые преимущества поддержки местных производителей, существуют некоторые риски, которые могут возникнуть в подобном подходе. Наверное, самый главный </w:t>
+      </w:r>
+      <w:r>
+        <w:rPr>
+          <w:sz w:val="24"/>
+          <w:szCs w:val="24"/>
+        </w:rPr>
+        <w:t>недочет</w:t>
+      </w:r>
+      <w:r>
+        <w:rPr>
+          <w:sz w:val="24"/>
+          <w:szCs w:val="24"/>
+        </w:rPr>
+        <w:t xml:space="preserve"> чрезмерной помощи подобным компаниям – возможное снижение конкурентоспособности экономического рынка. Поддержка государства может создавать не равные условия, в рамках которых иностранным компаниям будет сложно развиваться и продавать свой продукт, что может создать монополистов на </w:t>
+      </w:r>
+      <w:r>
+        <w:rPr>
+          <w:sz w:val="24"/>
+          <w:szCs w:val="24"/>
+        </w:rPr>
+        <w:t xml:space="preserve">локальном </w:t>
+      </w:r>
+      <w:r>
+        <w:rPr>
+          <w:sz w:val="24"/>
+          <w:szCs w:val="24"/>
+        </w:rPr>
+        <w:t>рынке</w:t>
+      </w:r>
+      <w:r>
+        <w:rPr>
+          <w:sz w:val="24"/>
+          <w:szCs w:val="24"/>
+        </w:rPr>
+        <w:t xml:space="preserve">. </w:t>
+      </w:r>
+      <w:r>
+        <w:rPr>
+          <w:sz w:val="24"/>
+          <w:szCs w:val="24"/>
+        </w:rPr>
+        <w:t>Подобная ситуация созда</w:t>
+      </w:r>
+      <w:r>
+        <w:rPr>
+          <w:sz w:val="24"/>
+          <w:szCs w:val="24"/>
+        </w:rPr>
+        <w:t>ет</w:t>
+      </w:r>
+      <w:r>
+        <w:rPr>
+          <w:sz w:val="24"/>
+          <w:szCs w:val="24"/>
+        </w:rPr>
+        <w:t xml:space="preserve"> условия, </w:t>
+      </w:r>
+      <w:r>
+        <w:rPr>
+          <w:sz w:val="24"/>
+          <w:szCs w:val="24"/>
+        </w:rPr>
+        <w:t xml:space="preserve">в которых компании не будут иметь </w:t>
+      </w:r>
+      <w:r>
+        <w:rPr>
+          <w:sz w:val="24"/>
+          <w:szCs w:val="24"/>
+        </w:rPr>
+        <w:t>достаточный стимул для развития технологи</w:t>
+      </w:r>
+      <w:r>
+        <w:rPr>
+          <w:sz w:val="24"/>
+          <w:szCs w:val="24"/>
+        </w:rPr>
+        <w:t xml:space="preserve">й, </w:t>
+      </w:r>
+      <w:r>
+        <w:rPr>
+          <w:sz w:val="24"/>
+          <w:szCs w:val="24"/>
+        </w:rPr>
+        <w:t xml:space="preserve">улучшения качества </w:t>
+      </w:r>
+      <w:r>
+        <w:rPr>
+          <w:sz w:val="24"/>
+          <w:szCs w:val="24"/>
+        </w:rPr>
+        <w:t>товаров</w:t>
+      </w:r>
+      <w:r>
+        <w:rPr>
+          <w:sz w:val="24"/>
+          <w:szCs w:val="24"/>
+        </w:rPr>
+        <w:t xml:space="preserve"> и </w:t>
+      </w:r>
+      <w:r>
+        <w:rPr>
+          <w:sz w:val="24"/>
+          <w:szCs w:val="24"/>
+        </w:rPr>
+        <w:t xml:space="preserve">оптимизации </w:t>
+      </w:r>
+      <w:r>
+        <w:rPr>
+          <w:sz w:val="24"/>
+          <w:szCs w:val="24"/>
+        </w:rPr>
+        <w:t>логистических цепочек</w:t>
+      </w:r>
+      <w:r>
+        <w:rPr>
+          <w:sz w:val="24"/>
+          <w:szCs w:val="24"/>
+        </w:rPr>
+        <w:t xml:space="preserve">, </w:t>
+      </w:r>
+      <w:r>
+        <w:rPr>
+          <w:sz w:val="24"/>
+          <w:szCs w:val="24"/>
+        </w:rPr>
+        <w:t xml:space="preserve">что приведет к стагнации и </w:t>
+      </w:r>
+      <w:r>
+        <w:rPr>
+          <w:sz w:val="24"/>
+          <w:szCs w:val="24"/>
+        </w:rPr>
+        <w:t>повышени</w:t>
+      </w:r>
+      <w:r>
+        <w:rPr>
+          <w:sz w:val="24"/>
+          <w:szCs w:val="24"/>
+        </w:rPr>
+        <w:t>ю розничных цен.</w:t>
+      </w:r>
+    </w:p>
+    <w:p>
+      <w:pPr>
+        <w:spacing w:line="360" w:lineRule="auto"/>
+        <w:ind w:firstLine="709"/>
+        <w:jc w:val="both"/>
+        <w:rPr>
+          <w:sz w:val="24"/>
+          <w:szCs w:val="24"/>
+        </w:rPr>
+      </w:pPr>
+      <w:r>
+        <w:rPr>
+          <w:sz w:val="24"/>
+          <w:szCs w:val="24"/>
+        </w:rPr>
+        <w:t xml:space="preserve">Еще одним недостатком поддержки отечественных производителей является усиленное влияние государства на экономический рынок. </w:t>
+      </w:r>
+      <w:r>
+        <w:rPr>
+          <w:sz w:val="24"/>
+          <w:szCs w:val="24"/>
+        </w:rPr>
+        <w:t>Постоянно п</w:t>
+      </w:r>
+      <w:r>
+        <w:rPr>
+          <w:sz w:val="24"/>
+          <w:szCs w:val="24"/>
+        </w:rPr>
+        <w:t>редоставляя различные формы помощи</w:t>
+      </w:r>
+      <w:r>
+        <w:rPr>
+          <w:sz w:val="24"/>
+          <w:szCs w:val="24"/>
+        </w:rPr>
+        <w:t xml:space="preserve"> в виде субсидий, грантов, льготных кредитов или каких-либо налоговых льгот</w:t>
+      </w:r>
+      <w:r>
+        <w:rPr>
+          <w:sz w:val="24"/>
+          <w:szCs w:val="24"/>
+        </w:rPr>
+        <w:t>, государство может быть слишком сильно вовлечено в экономические процессы, что может привести к снижению свободы на рынке, затруднить конкуренцию и сформировать зависимые от поддержки предприятия</w:t>
+      </w:r>
+      <w:r>
+        <w:rPr>
+          <w:sz w:val="24"/>
+          <w:szCs w:val="24"/>
+        </w:rPr>
+        <w:t>, которые без подобной помощи не смогу существовать или поддерживать непрерывную работу предприятий,</w:t>
+      </w:r>
+      <w:r>
+        <w:rPr>
+          <w:sz w:val="24"/>
+          <w:szCs w:val="24"/>
+        </w:rPr>
+        <w:t xml:space="preserve"> что также плохо скажется на экономическом состоянии страны. </w:t>
+      </w:r>
+    </w:p>
+    <w:p>
+      <w:pPr>
+        <w:spacing w:line="360" w:lineRule="auto"/>
+        <w:ind w:firstLine="709"/>
+        <w:jc w:val="both"/>
+        <w:rPr>
+          <w:sz w:val="24"/>
+          <w:szCs w:val="24"/>
+        </w:rPr>
+      </w:pPr>
+      <w:r>
+        <w:rPr>
+          <w:sz w:val="24"/>
+          <w:szCs w:val="24"/>
+        </w:rPr>
+        <w:t xml:space="preserve">Еще одним негативным фактором может выступить международная торговля и экономика. Слишком активная поддержка государства местных компаний может вызвать недовольство у стран-партнеров, так как их продукция, сырье или услуги будут продаваться меньше в рамках нечестной конкуренции. Подобные ситуации могут привести к определенным ограничениям, снижению экспорта, конкурентоспособности страны на мировом рынке, а в худшем случае к конфликтам. </w:t>
+      </w:r>
+    </w:p>
+    <w:p>
+      <w:pPr>
+        <w:spacing w:line="360" w:lineRule="auto"/>
+        <w:ind w:firstLine="708"/>
+        <w:jc w:val="both"/>
+        <w:rPr>
+          <w:sz w:val="24"/>
+          <w:szCs w:val="24"/>
+        </w:rPr>
+      </w:pPr>
+      <w:r>
+        <w:rPr>
+          <w:sz w:val="24"/>
+          <w:szCs w:val="24"/>
+        </w:rPr>
+        <w:t>Таким образом, поддержка отечественных производителей государством является важным и необходимым инструментом для экономики, который может помочь улучшить экономическое положение страны, социальную составляющую, пополнить недостающий бюджет и закрепиться на международном рынке. Подобная помощь со стороны государства неотъемлема при построении сильной экономики, однако ей стоит пользоваться взвешенно и аккуратно, чтобы не создавать нечестных условий, при которых конкуренция</w:t>
+      </w:r>
+      <w:r>
+        <w:rPr>
+          <w:sz w:val="24"/>
+          <w:szCs w:val="24"/>
+        </w:rPr>
+        <w:t xml:space="preserve"> для определенных компаний</w:t>
+      </w:r>
+      <w:r>
+        <w:rPr>
+          <w:sz w:val="24"/>
+          <w:szCs w:val="24"/>
+        </w:rPr>
+        <w:t xml:space="preserve"> становится невозможна, зависимых от государства предприятий и не провоцировать какие-либо недопонимания или конфликты на международном рынке</w:t>
+      </w:r>
+      <w:r>
+        <w:rPr>
+          <w:sz w:val="24"/>
+          <w:szCs w:val="24"/>
+        </w:rPr>
+        <w:t xml:space="preserve">, что может поставить экономику в еще более худшее </w:t>
+      </w:r>
+      <w:r>
+        <w:rPr>
+          <w:sz w:val="24"/>
+          <w:szCs w:val="24"/>
+        </w:rPr>
+        <w:lastRenderedPageBreak/>
+        <w:t xml:space="preserve">положение. </w:t>
+      </w:r>
+      <w:r>
+        <w:rPr>
+          <w:sz w:val="24"/>
+          <w:szCs w:val="24"/>
+        </w:rPr>
+        <w:t>В таком случае, при правильном применении поддержка государства отечественных предприятий становится наиболее эффективным способом для укрепления экономического состояния и повышени</w:t>
+      </w:r>
+      <w:r>
+        <w:rPr>
+          <w:sz w:val="24"/>
+          <w:szCs w:val="24"/>
+        </w:rPr>
+        <w:t>я</w:t>
+      </w:r>
+      <w:r>
+        <w:rPr>
+          <w:sz w:val="24"/>
+          <w:szCs w:val="24"/>
+        </w:rPr>
+        <w:t xml:space="preserve"> конкурентоспособности на международном</w:t>
+      </w:r>
+      <w:r>
+        <w:rPr>
+          <w:sz w:val="24"/>
+          <w:szCs w:val="24"/>
+        </w:rPr>
+        <w:t xml:space="preserve"> </w:t>
+      </w:r>
+      <w:r>
+        <w:rPr>
+          <w:sz w:val="24"/>
+          <w:szCs w:val="24"/>
+        </w:rPr>
+        <w:t>уровне.</w:t>
+      </w:r>
+    </w:p>
+    <w:p>
+      <w:pPr>
+        <w:spacing w:line="360" w:lineRule="auto"/>
+        <w:jc w:val="center"/>
         <w:rPr>
           <w:sz w:val="24"/>
           <w:szCs w:val="24"/>
@@ -3426,11 +4269,90 @@
         </w:rPr>
         <w:t>Список используемое литературы</w:t>
       </w:r>
+      <w:r>
+        <w:rPr>
+          <w:sz w:val="24"/>
+          <w:szCs w:val="24"/>
+        </w:rPr>
+        <w:t>:</w:t>
+      </w:r>
+    </w:p>
+    <w:p>
+      <w:pPr>
+        <w:pStyle w:val="a6"/>
+        <w:numPr>
+          <w:ilvl w:val="6"/>
+          <w:numId w:val="4"/>
+        </w:numPr>
+        <w:spacing w:line="360" w:lineRule="auto"/>
+        <w:ind w:left="0" w:firstLine="851"/>
+        <w:jc w:val="both"/>
+        <w:rPr>
+          <w:sz w:val="24"/>
+          <w:szCs w:val="24"/>
+        </w:rPr>
+      </w:pPr>
+      <w:r>
+        <w:rPr>
+          <w:sz w:val="24"/>
+          <w:szCs w:val="24"/>
+        </w:rPr>
+        <w:t xml:space="preserve">Роль государства в поддержке отечественного производителя и методы осуществления такой поддержки // Молодой учёный URL: </w:t>
+      </w:r>
+      <w:hyperlink r:id="rId12" w:history="1">
+        <w:r>
+          <w:rPr>
+            <w:rStyle w:val="af1"/>
+            <w:sz w:val="24"/>
+            <w:szCs w:val="24"/>
+          </w:rPr>
+          <w:t>https://moluch.ru/archive/458/1007</w:t>
+        </w:r>
+        <w:r>
+          <w:rPr>
+            <w:rStyle w:val="af1"/>
+            <w:sz w:val="24"/>
+            <w:szCs w:val="24"/>
+          </w:rPr>
+          <w:t>7</w:t>
+        </w:r>
+        <w:r>
+          <w:rPr>
+            <w:rStyle w:val="af1"/>
+            <w:sz w:val="24"/>
+            <w:szCs w:val="24"/>
+          </w:rPr>
+          <w:t>8</w:t>
+        </w:r>
+      </w:hyperlink>
+    </w:p>
+    <w:p>
+      <w:pPr>
+        <w:pStyle w:val="a6"/>
+        <w:numPr>
+          <w:ilvl w:val="6"/>
+          <w:numId w:val="4"/>
+        </w:numPr>
+        <w:spacing w:line="360" w:lineRule="auto"/>
+        <w:ind w:left="0" w:firstLine="851"/>
+        <w:jc w:val="both"/>
+        <w:rPr>
+          <w:sz w:val="24"/>
+          <w:szCs w:val="24"/>
+        </w:rPr>
+      </w:pPr>
+      <w:r>
+        <w:rPr>
+          <w:sz w:val="24"/>
+          <w:szCs w:val="24"/>
+        </w:rPr>
+        <w:t>Роль государства в поддержке отечественного производителя и методы осуществления такой поддержки // Молодой учёный URL: https://moluch.ru/archive/458/100800</w:t>
+      </w:r>
     </w:p>
     <w:sectPr>
-      <w:footerReference w:type="even" r:id="rId12"/>
-      <w:footerReference w:type="default" r:id="rId13"/>
-      <w:footerReference w:type="first" r:id="rId14"/>
+      <w:footerReference w:type="even" r:id="rId13"/>
+      <w:footerReference w:type="default" r:id="rId14"/>
+      <w:footerReference w:type="first" r:id="rId15"/>
       <w:pgSz w:w="11906" w:h="16838"/>
       <w:pgMar w:top="1134" w:right="850" w:bottom="1134" w:left="1701" w:header="0" w:footer="708" w:gutter="0"/>
       <w:cols w:space="720"/>
@@ -4924,6 +5846,18 @@
       </w:tblBorders>
     </w:tblPr>
   </w:style>
+  <w:style w:type="character" w:styleId="af8">
+    <w:name w:val="FollowedHyperlink"/>
+    <w:basedOn w:val="a0"/>
+    <w:uiPriority w:val="99"/>
+    <w:semiHidden/>
+    <w:unhideWhenUsed/>
+    <w:rsid w:val="0011484A"/>
+    <w:rPr>
+      <w:color w:val="954F72" w:themeColor="followedHyperlink"/>
+      <w:u w:val="single"/>
+    </w:rPr>
+  </w:style>
 </w:styles>
 </file>
 

</xml_diff>